<commit_message>
ISAS:lab2 in progress. PHPBB forum engine instalation in progress
</commit_message>
<xml_diff>
--- a/ISAS/Reports/Report_2.docx
+++ b/ISAS/Reports/Report_2.docx
@@ -10,6 +10,17 @@
           <w:szCs w:val="28"/>
         </w:rPr>
       </w:pPr>
+      <w:proofErr w:type="spellStart"/>
+      <w:r>
+        <w:rPr>
+          <w:color w:val="000000"/>
+          <w:sz w:val="28"/>
+          <w:szCs w:val="28"/>
+          <w:lang w:val="en-US"/>
+        </w:rPr>
+        <w:t>cle</w:t>
+      </w:r>
+      <w:proofErr w:type="spellEnd"/>
       <w:r>
         <w:rPr>
           <w:color w:val="000000"/>
@@ -1065,7 +1076,6 @@
         <w:rPr>
           <w:sz w:val="28"/>
           <w:szCs w:val="28"/>
-          <w:lang w:val="en-US"/>
         </w:rPr>
       </w:pPr>
       <w:r>
@@ -1974,10 +1984,10 @@
         </w:rPr>
         <w:lastRenderedPageBreak/>
         <w:drawing>
-          <wp:inline distT="0" distB="0" distL="0" distR="0" wp14:anchorId="2C47DC41" wp14:editId="34CA6BF7">
-            <wp:extent cx="6372225" cy="3785235"/>
-            <wp:effectExtent l="0" t="0" r="9525" b="5715"/>
-            <wp:docPr id="9" name="Рисунок 9"/>
+          <wp:inline distT="0" distB="0" distL="0" distR="0" wp14:anchorId="5CB377CB" wp14:editId="64C82757">
+            <wp:extent cx="6372225" cy="2271395"/>
+            <wp:effectExtent l="0" t="0" r="9525" b="0"/>
+            <wp:docPr id="12" name="Рисунок 12"/>
             <wp:cNvGraphicFramePr>
               <a:graphicFrameLocks xmlns:a="http://schemas.openxmlformats.org/drawingml/2006/main" noChangeAspect="1"/>
             </wp:cNvGraphicFramePr>
@@ -1997,7 +2007,7 @@
                   <pic:spPr>
                     <a:xfrm>
                       <a:off x="0" y="0"/>
-                      <a:ext cx="6372225" cy="3785235"/>
+                      <a:ext cx="6372225" cy="2271395"/>
                     </a:xfrm>
                     <a:prstGeom prst="rect">
                       <a:avLst/>
@@ -2023,29 +2033,36 @@
           <w:sz w:val="28"/>
           <w:szCs w:val="28"/>
         </w:rPr>
-        <w:t xml:space="preserve">Рисунок 1.8 – Результат добавления записей для разрешения </w:t>
-      </w:r>
-      <w:r>
-        <w:rPr>
-          <w:sz w:val="28"/>
-          <w:szCs w:val="28"/>
-          <w:lang w:val="en-US"/>
-        </w:rPr>
-        <w:t>IP</w:t>
-      </w:r>
-      <w:r>
-        <w:rPr>
-          <w:sz w:val="28"/>
-          <w:szCs w:val="28"/>
-        </w:rPr>
-        <w:t>-</w:t>
-      </w:r>
-      <w:r>
-        <w:rPr>
-          <w:sz w:val="28"/>
-          <w:szCs w:val="28"/>
-        </w:rPr>
-        <w:t>адреса в символические имена сайтов</w:t>
+        <w:t xml:space="preserve">Рисунок 1.8 – </w:t>
+      </w:r>
+      <w:r>
+        <w:rPr>
+          <w:sz w:val="28"/>
+          <w:szCs w:val="28"/>
+        </w:rPr>
+        <w:t xml:space="preserve">Результат редактирования файла </w:t>
+      </w:r>
+      <w:r>
+        <w:rPr>
+          <w:sz w:val="28"/>
+          <w:szCs w:val="28"/>
+          <w:lang w:val="en-US"/>
+        </w:rPr>
+        <w:t>hosts</w:t>
+      </w:r>
+      <w:r>
+        <w:rPr>
+          <w:sz w:val="28"/>
+          <w:szCs w:val="28"/>
+        </w:rPr>
+        <w:t xml:space="preserve"> </w:t>
+      </w:r>
+      <w:r>
+        <w:rPr>
+          <w:sz w:val="28"/>
+          <w:szCs w:val="28"/>
+        </w:rPr>
+        <w:t>на физической машине</w:t>
       </w:r>
     </w:p>
     <w:p>
@@ -2254,7 +2271,7 @@
                 <w:sz w:val="28"/>
                 <w:szCs w:val="28"/>
               </w:rPr>
-              <w:t>D90KdXhOh7SduIaT</w:t>
+              <w:t>Zo6wJ!0hsMaanVQm</w:t>
             </w:r>
           </w:p>
         </w:tc>
@@ -2298,7 +2315,23 @@
                 <w:sz w:val="28"/>
                 <w:szCs w:val="28"/>
               </w:rPr>
-              <w:t>dHCNujsjT7q2xR8J</w:t>
+              <w:t>2</w:t>
+            </w:r>
+            <w:proofErr w:type="gramStart"/>
+            <w:r>
+              <w:rPr>
+                <w:sz w:val="28"/>
+                <w:szCs w:val="28"/>
+              </w:rPr>
+              <w:t>L)(</w:t>
+            </w:r>
+            <w:proofErr w:type="gramEnd"/>
+            <w:r>
+              <w:rPr>
+                <w:sz w:val="28"/>
+                <w:szCs w:val="28"/>
+              </w:rPr>
+              <w:t>/@oZ4Z(!vc@N</w:t>
             </w:r>
           </w:p>
         </w:tc>
@@ -2342,7 +2375,7 @@
                 <w:sz w:val="28"/>
                 <w:szCs w:val="28"/>
               </w:rPr>
-              <w:t>05FPMCJn9aVYbhrP</w:t>
+              <w:t>wgvul9cAf.K_GZ7e</w:t>
             </w:r>
           </w:p>
         </w:tc>
@@ -2579,15 +2612,14 @@
       </w:pPr>
       <w:r>
         <w:rPr>
-          <w:noProof/>
           <w:sz w:val="28"/>
           <w:szCs w:val="28"/>
         </w:rPr>
         <w:drawing>
-          <wp:inline distT="0" distB="0" distL="0" distR="0" wp14:anchorId="3C9F8CC6" wp14:editId="7A1DB76A">
-            <wp:extent cx="6372225" cy="2839720"/>
+          <wp:inline distT="0" distB="0" distL="0" distR="0" wp14:anchorId="0CFF4C66" wp14:editId="3EC7F98A">
+            <wp:extent cx="6372225" cy="3073400"/>
             <wp:effectExtent l="0" t="0" r="9525" b="0"/>
-            <wp:docPr id="10" name="Рисунок 10"/>
+            <wp:docPr id="9" name="Рисунок 9"/>
             <wp:cNvGraphicFramePr>
               <a:graphicFrameLocks xmlns:a="http://schemas.openxmlformats.org/drawingml/2006/main" noChangeAspect="1"/>
             </wp:cNvGraphicFramePr>
@@ -2607,7 +2639,7 @@
                   <pic:spPr>
                     <a:xfrm>
                       <a:off x="0" y="0"/>
-                      <a:ext cx="6372225" cy="2839720"/>
+                      <a:ext cx="6372225" cy="3073400"/>
                     </a:xfrm>
                     <a:prstGeom prst="rect">
                       <a:avLst/>
@@ -2660,7 +2692,2934 @@
     </w:p>
     <w:p>
       <w:pPr>
-        <w:ind w:firstLine="709"/>
+        <w:spacing w:before="240"/>
+        <w:ind w:firstLine="708"/>
+        <w:jc w:val="both"/>
+        <w:rPr>
+          <w:sz w:val="28"/>
+          <w:szCs w:val="28"/>
+        </w:rPr>
+      </w:pPr>
+      <w:r>
+        <w:rPr>
+          <w:sz w:val="28"/>
+          <w:szCs w:val="28"/>
+        </w:rPr>
+        <w:t xml:space="preserve">Теперь необходимо создать директорию для загрузки, так как по умолчанию </w:t>
+      </w:r>
+      <w:proofErr w:type="spellStart"/>
+      <w:r>
+        <w:rPr>
+          <w:sz w:val="28"/>
+          <w:szCs w:val="28"/>
+          <w:lang w:val="en-US"/>
+        </w:rPr>
+        <w:t>VSFTPd</w:t>
+      </w:r>
+      <w:proofErr w:type="spellEnd"/>
+      <w:r>
+        <w:rPr>
+          <w:sz w:val="28"/>
+          <w:szCs w:val="28"/>
+          <w:lang w:val="en-US"/>
+        </w:rPr>
+        <w:t xml:space="preserve"> </w:t>
+      </w:r>
+      <w:r>
+        <w:rPr>
+          <w:sz w:val="28"/>
+          <w:szCs w:val="28"/>
+        </w:rPr>
+        <w:t>не принимает корневую директорию (рисунок 2.3)</w:t>
+      </w:r>
+    </w:p>
+    <w:p>
+      <w:pPr>
+        <w:spacing w:before="240" w:after="120"/>
+        <w:jc w:val="center"/>
+        <w:rPr>
+          <w:sz w:val="28"/>
+          <w:szCs w:val="28"/>
+        </w:rPr>
+      </w:pPr>
+      <w:r>
+        <w:rPr>
+          <w:sz w:val="28"/>
+          <w:szCs w:val="28"/>
+        </w:rPr>
+        <w:drawing>
+          <wp:inline distT="0" distB="0" distL="0" distR="0" wp14:anchorId="3A213B31" wp14:editId="27E88A63">
+            <wp:extent cx="6249272" cy="600159"/>
+            <wp:effectExtent l="0" t="0" r="0" b="9525"/>
+            <wp:docPr id="11" name="Рисунок 11"/>
+            <wp:cNvGraphicFramePr>
+              <a:graphicFrameLocks xmlns:a="http://schemas.openxmlformats.org/drawingml/2006/main" noChangeAspect="1"/>
+            </wp:cNvGraphicFramePr>
+            <a:graphic xmlns:a="http://schemas.openxmlformats.org/drawingml/2006/main">
+              <a:graphicData uri="http://schemas.openxmlformats.org/drawingml/2006/picture">
+                <pic:pic xmlns:pic="http://schemas.openxmlformats.org/drawingml/2006/picture">
+                  <pic:nvPicPr>
+                    <pic:cNvPr id="1" name=""/>
+                    <pic:cNvPicPr/>
+                  </pic:nvPicPr>
+                  <pic:blipFill>
+                    <a:blip r:embed="rId16"/>
+                    <a:stretch>
+                      <a:fillRect/>
+                    </a:stretch>
+                  </pic:blipFill>
+                  <pic:spPr>
+                    <a:xfrm>
+                      <a:off x="0" y="0"/>
+                      <a:ext cx="6249272" cy="600159"/>
+                    </a:xfrm>
+                    <a:prstGeom prst="rect">
+                      <a:avLst/>
+                    </a:prstGeom>
+                  </pic:spPr>
+                </pic:pic>
+              </a:graphicData>
+            </a:graphic>
+          </wp:inline>
+        </w:drawing>
+      </w:r>
+    </w:p>
+    <w:p>
+      <w:pPr>
+        <w:spacing w:after="120"/>
+        <w:jc w:val="center"/>
+        <w:rPr>
+          <w:sz w:val="28"/>
+          <w:szCs w:val="28"/>
+          <w:lang w:val="en-US"/>
+        </w:rPr>
+      </w:pPr>
+      <w:r>
+        <w:rPr>
+          <w:sz w:val="28"/>
+          <w:szCs w:val="28"/>
+        </w:rPr>
+        <w:t xml:space="preserve">Рисунок 2.3 – Результат создания директории для </w:t>
+      </w:r>
+      <w:proofErr w:type="spellStart"/>
+      <w:r>
+        <w:rPr>
+          <w:sz w:val="28"/>
+          <w:szCs w:val="28"/>
+          <w:lang w:val="en-US"/>
+        </w:rPr>
+        <w:t>VSFTPd</w:t>
+      </w:r>
+      <w:proofErr w:type="spellEnd"/>
+    </w:p>
+    <w:p>
+      <w:pPr>
+        <w:ind w:firstLine="708"/>
+        <w:jc w:val="both"/>
+        <w:rPr>
+          <w:sz w:val="28"/>
+          <w:szCs w:val="28"/>
+        </w:rPr>
+      </w:pPr>
+      <w:r>
+        <w:rPr>
+          <w:sz w:val="28"/>
+          <w:szCs w:val="28"/>
+        </w:rPr>
+        <w:lastRenderedPageBreak/>
+        <w:t>Следующим шагом необходимо отредактировать конфигурационный файл ранее установленной службы</w:t>
+      </w:r>
+      <w:r>
+        <w:rPr>
+          <w:sz w:val="28"/>
+          <w:szCs w:val="28"/>
+        </w:rPr>
+        <w:t xml:space="preserve"> </w:t>
+      </w:r>
+      <w:proofErr w:type="gramStart"/>
+      <w:r>
+        <w:rPr>
+          <w:sz w:val="28"/>
+          <w:szCs w:val="28"/>
+        </w:rPr>
+        <w:t>и ,</w:t>
+      </w:r>
+      <w:proofErr w:type="gramEnd"/>
+      <w:r>
+        <w:rPr>
+          <w:sz w:val="28"/>
+          <w:szCs w:val="28"/>
+        </w:rPr>
+        <w:t xml:space="preserve"> для применения изменений, перезапустить её с помощью команды </w:t>
+      </w:r>
+      <w:proofErr w:type="spellStart"/>
+      <w:r>
+        <w:rPr>
+          <w:sz w:val="28"/>
+          <w:szCs w:val="28"/>
+          <w:lang w:val="en-US"/>
+        </w:rPr>
+        <w:t>systemctl</w:t>
+      </w:r>
+      <w:proofErr w:type="spellEnd"/>
+      <w:r>
+        <w:rPr>
+          <w:sz w:val="28"/>
+          <w:szCs w:val="28"/>
+        </w:rPr>
+        <w:t xml:space="preserve"> </w:t>
+      </w:r>
+      <w:r>
+        <w:rPr>
+          <w:sz w:val="28"/>
+          <w:szCs w:val="28"/>
+          <w:lang w:val="en-US"/>
+        </w:rPr>
+        <w:t>restart</w:t>
+      </w:r>
+      <w:r>
+        <w:rPr>
+          <w:sz w:val="28"/>
+          <w:szCs w:val="28"/>
+        </w:rPr>
+        <w:t xml:space="preserve"> </w:t>
+      </w:r>
+      <w:proofErr w:type="spellStart"/>
+      <w:r>
+        <w:rPr>
+          <w:sz w:val="28"/>
+          <w:szCs w:val="28"/>
+          <w:lang w:val="en-US"/>
+        </w:rPr>
+        <w:t>vsftpd</w:t>
+      </w:r>
+      <w:proofErr w:type="spellEnd"/>
+      <w:r>
+        <w:rPr>
+          <w:sz w:val="28"/>
+          <w:szCs w:val="28"/>
+        </w:rPr>
+        <w:t xml:space="preserve">. </w:t>
+      </w:r>
+      <w:r>
+        <w:rPr>
+          <w:sz w:val="28"/>
+          <w:szCs w:val="28"/>
+        </w:rPr>
+        <w:t>Результат проверки статуса работы службы после перезапуска представлен на рисунке 2.4.</w:t>
+      </w:r>
+    </w:p>
+    <w:p>
+      <w:pPr>
+        <w:spacing w:before="240" w:after="120"/>
+        <w:jc w:val="center"/>
+        <w:rPr>
+          <w:sz w:val="28"/>
+          <w:szCs w:val="28"/>
+        </w:rPr>
+      </w:pPr>
+      <w:r>
+        <w:rPr>
+          <w:sz w:val="28"/>
+          <w:szCs w:val="28"/>
+        </w:rPr>
+        <w:drawing>
+          <wp:inline distT="0" distB="0" distL="0" distR="0" wp14:anchorId="6378DB6F" wp14:editId="4A00E8BB">
+            <wp:extent cx="6372225" cy="2037715"/>
+            <wp:effectExtent l="0" t="0" r="9525" b="635"/>
+            <wp:docPr id="13" name="Рисунок 13"/>
+            <wp:cNvGraphicFramePr>
+              <a:graphicFrameLocks xmlns:a="http://schemas.openxmlformats.org/drawingml/2006/main" noChangeAspect="1"/>
+            </wp:cNvGraphicFramePr>
+            <a:graphic xmlns:a="http://schemas.openxmlformats.org/drawingml/2006/main">
+              <a:graphicData uri="http://schemas.openxmlformats.org/drawingml/2006/picture">
+                <pic:pic xmlns:pic="http://schemas.openxmlformats.org/drawingml/2006/picture">
+                  <pic:nvPicPr>
+                    <pic:cNvPr id="1" name=""/>
+                    <pic:cNvPicPr/>
+                  </pic:nvPicPr>
+                  <pic:blipFill>
+                    <a:blip r:embed="rId17"/>
+                    <a:stretch>
+                      <a:fillRect/>
+                    </a:stretch>
+                  </pic:blipFill>
+                  <pic:spPr>
+                    <a:xfrm>
+                      <a:off x="0" y="0"/>
+                      <a:ext cx="6372225" cy="2037715"/>
+                    </a:xfrm>
+                    <a:prstGeom prst="rect">
+                      <a:avLst/>
+                    </a:prstGeom>
+                  </pic:spPr>
+                </pic:pic>
+              </a:graphicData>
+            </a:graphic>
+          </wp:inline>
+        </w:drawing>
+      </w:r>
+    </w:p>
+    <w:p>
+      <w:pPr>
+        <w:jc w:val="center"/>
+        <w:rPr>
+          <w:sz w:val="28"/>
+          <w:szCs w:val="28"/>
+          <w:lang w:val="en-US"/>
+        </w:rPr>
+      </w:pPr>
+      <w:r>
+        <w:rPr>
+          <w:sz w:val="28"/>
+          <w:szCs w:val="28"/>
+        </w:rPr>
+        <w:t xml:space="preserve">Рисунок 2.4 – Результат настройки </w:t>
+      </w:r>
+      <w:proofErr w:type="spellStart"/>
+      <w:r>
+        <w:rPr>
+          <w:sz w:val="28"/>
+          <w:szCs w:val="28"/>
+          <w:lang w:val="en-US"/>
+        </w:rPr>
+        <w:t>VSFTPd</w:t>
+      </w:r>
+      <w:proofErr w:type="spellEnd"/>
+    </w:p>
+    <w:p>
+      <w:pPr>
+        <w:spacing w:before="240"/>
+        <w:ind w:firstLine="708"/>
+        <w:rPr>
+          <w:sz w:val="28"/>
+          <w:szCs w:val="28"/>
+        </w:rPr>
+      </w:pPr>
+      <w:r>
+        <w:rPr>
+          <w:sz w:val="28"/>
+          <w:szCs w:val="28"/>
+        </w:rPr>
+        <w:t xml:space="preserve">Теперь для проверки возможности подключения и передачи файлов на физической машине был установлен </w:t>
+      </w:r>
+      <w:r>
+        <w:rPr>
+          <w:sz w:val="28"/>
+          <w:szCs w:val="28"/>
+          <w:lang w:val="en-US"/>
+        </w:rPr>
+        <w:t>FTP</w:t>
+      </w:r>
+      <w:r>
+        <w:rPr>
+          <w:sz w:val="28"/>
+          <w:szCs w:val="28"/>
+        </w:rPr>
+        <w:t>-</w:t>
+      </w:r>
+      <w:r>
+        <w:rPr>
+          <w:sz w:val="28"/>
+          <w:szCs w:val="28"/>
+        </w:rPr>
+        <w:t xml:space="preserve">клиент </w:t>
+      </w:r>
+      <w:r>
+        <w:rPr>
+          <w:sz w:val="28"/>
+          <w:szCs w:val="28"/>
+          <w:lang w:val="en-US"/>
+        </w:rPr>
+        <w:t>FileZilla</w:t>
+      </w:r>
+      <w:r>
+        <w:rPr>
+          <w:sz w:val="28"/>
+          <w:szCs w:val="28"/>
+        </w:rPr>
+        <w:t xml:space="preserve">. </w:t>
+      </w:r>
+      <w:r>
+        <w:rPr>
+          <w:sz w:val="28"/>
+          <w:szCs w:val="28"/>
+        </w:rPr>
+        <w:t>Результат проверки работоспособности соединения представлен на рисунке 2.5.</w:t>
+      </w:r>
+    </w:p>
+    <w:p>
+      <w:pPr>
+        <w:spacing w:before="240" w:after="120"/>
+        <w:jc w:val="center"/>
+        <w:rPr>
+          <w:sz w:val="28"/>
+          <w:szCs w:val="28"/>
+          <w:lang w:val="en-US"/>
+        </w:rPr>
+      </w:pPr>
+      <w:r>
+        <w:rPr>
+          <w:sz w:val="28"/>
+          <w:szCs w:val="28"/>
+          <w:lang w:val="en-US"/>
+        </w:rPr>
+        <w:drawing>
+          <wp:inline distT="0" distB="0" distL="0" distR="0" wp14:anchorId="47636907" wp14:editId="114314AA">
+            <wp:extent cx="6372225" cy="1995170"/>
+            <wp:effectExtent l="0" t="0" r="9525" b="5080"/>
+            <wp:docPr id="14" name="Рисунок 14"/>
+            <wp:cNvGraphicFramePr>
+              <a:graphicFrameLocks xmlns:a="http://schemas.openxmlformats.org/drawingml/2006/main" noChangeAspect="1"/>
+            </wp:cNvGraphicFramePr>
+            <a:graphic xmlns:a="http://schemas.openxmlformats.org/drawingml/2006/main">
+              <a:graphicData uri="http://schemas.openxmlformats.org/drawingml/2006/picture">
+                <pic:pic xmlns:pic="http://schemas.openxmlformats.org/drawingml/2006/picture">
+                  <pic:nvPicPr>
+                    <pic:cNvPr id="1" name=""/>
+                    <pic:cNvPicPr/>
+                  </pic:nvPicPr>
+                  <pic:blipFill>
+                    <a:blip r:embed="rId18"/>
+                    <a:stretch>
+                      <a:fillRect/>
+                    </a:stretch>
+                  </pic:blipFill>
+                  <pic:spPr>
+                    <a:xfrm>
+                      <a:off x="0" y="0"/>
+                      <a:ext cx="6372225" cy="1995170"/>
+                    </a:xfrm>
+                    <a:prstGeom prst="rect">
+                      <a:avLst/>
+                    </a:prstGeom>
+                  </pic:spPr>
+                </pic:pic>
+              </a:graphicData>
+            </a:graphic>
+          </wp:inline>
+        </w:drawing>
+      </w:r>
+    </w:p>
+    <w:p>
+      <w:pPr>
+        <w:jc w:val="center"/>
+        <w:rPr>
+          <w:sz w:val="28"/>
+          <w:szCs w:val="28"/>
+          <w:lang w:val="en-US"/>
+        </w:rPr>
+      </w:pPr>
+      <w:r>
+        <w:rPr>
+          <w:sz w:val="28"/>
+          <w:szCs w:val="28"/>
+        </w:rPr>
+        <w:t xml:space="preserve">Рисунок 2.5 – Проверка </w:t>
+      </w:r>
+      <w:r>
+        <w:rPr>
+          <w:sz w:val="28"/>
+          <w:szCs w:val="28"/>
+          <w:lang w:val="en-US"/>
+        </w:rPr>
+        <w:t>FTP</w:t>
+      </w:r>
+      <w:r>
+        <w:rPr>
+          <w:sz w:val="28"/>
+          <w:szCs w:val="28"/>
+        </w:rPr>
+        <w:t>-</w:t>
+      </w:r>
+      <w:r>
+        <w:rPr>
+          <w:sz w:val="28"/>
+          <w:szCs w:val="28"/>
+        </w:rPr>
+        <w:t xml:space="preserve">подключения через </w:t>
+      </w:r>
+      <w:r>
+        <w:rPr>
+          <w:sz w:val="28"/>
+          <w:szCs w:val="28"/>
+          <w:lang w:val="en-US"/>
+        </w:rPr>
+        <w:t>FileZilla</w:t>
+      </w:r>
+    </w:p>
+    <w:p>
+      <w:pPr>
+        <w:pStyle w:val="1"/>
+        <w:numPr>
+          <w:ilvl w:val="0"/>
+          <w:numId w:val="1"/>
+        </w:numPr>
+        <w:spacing w:after="240"/>
+        <w:jc w:val="both"/>
+        <w:rPr>
+          <w:rFonts w:ascii="Times New Roman" w:hAnsi="Times New Roman" w:cs="Times New Roman"/>
+          <w:b/>
+          <w:bCs/>
+          <w:color w:val="auto"/>
+          <w:sz w:val="28"/>
+          <w:szCs w:val="28"/>
+          <w:lang w:val="en-US"/>
+        </w:rPr>
+      </w:pPr>
+      <w:r>
+        <w:rPr>
+          <w:rFonts w:ascii="Times New Roman" w:hAnsi="Times New Roman" w:cs="Times New Roman"/>
+          <w:b/>
+          <w:bCs/>
+          <w:color w:val="auto"/>
+          <w:sz w:val="28"/>
+          <w:szCs w:val="28"/>
+        </w:rPr>
+        <w:t>Установка</w:t>
+      </w:r>
+      <w:r>
+        <w:rPr>
+          <w:rFonts w:ascii="Times New Roman" w:hAnsi="Times New Roman" w:cs="Times New Roman"/>
+          <w:b/>
+          <w:bCs/>
+          <w:color w:val="auto"/>
+          <w:sz w:val="28"/>
+          <w:szCs w:val="28"/>
+        </w:rPr>
+        <w:t xml:space="preserve"> </w:t>
+      </w:r>
+      <w:r>
+        <w:rPr>
+          <w:rFonts w:ascii="Times New Roman" w:hAnsi="Times New Roman" w:cs="Times New Roman"/>
+          <w:b/>
+          <w:bCs/>
+          <w:color w:val="auto"/>
+          <w:sz w:val="28"/>
+          <w:szCs w:val="28"/>
+        </w:rPr>
+        <w:t xml:space="preserve">и работа с </w:t>
+      </w:r>
+      <w:r>
+        <w:rPr>
+          <w:rFonts w:ascii="Times New Roman" w:hAnsi="Times New Roman" w:cs="Times New Roman"/>
+          <w:b/>
+          <w:bCs/>
+          <w:color w:val="auto"/>
+          <w:sz w:val="28"/>
+          <w:szCs w:val="28"/>
+          <w:lang w:val="en-US"/>
+        </w:rPr>
+        <w:t>Wordpress</w:t>
+      </w:r>
+    </w:p>
+    <w:p>
+      <w:pPr>
+        <w:ind w:firstLine="708"/>
+        <w:jc w:val="both"/>
+        <w:rPr>
+          <w:sz w:val="28"/>
+          <w:szCs w:val="28"/>
+        </w:rPr>
+      </w:pPr>
+      <w:r>
+        <w:rPr>
+          <w:sz w:val="28"/>
+          <w:szCs w:val="28"/>
+        </w:rPr>
+        <w:t xml:space="preserve">Далее для выполнения лабораторной работы необходимо установить </w:t>
+      </w:r>
+      <w:r>
+        <w:rPr>
+          <w:sz w:val="28"/>
+          <w:szCs w:val="28"/>
+          <w:lang w:val="en-US"/>
+        </w:rPr>
+        <w:t>CMS</w:t>
+      </w:r>
+      <w:r>
+        <w:rPr>
+          <w:sz w:val="28"/>
+          <w:szCs w:val="28"/>
+        </w:rPr>
+        <w:t xml:space="preserve"> </w:t>
+      </w:r>
+      <w:r>
+        <w:rPr>
+          <w:sz w:val="28"/>
+          <w:szCs w:val="28"/>
+          <w:lang w:val="en-US"/>
+        </w:rPr>
+        <w:t>Wordpress</w:t>
+      </w:r>
+      <w:r>
+        <w:rPr>
+          <w:sz w:val="28"/>
+          <w:szCs w:val="28"/>
+        </w:rPr>
+        <w:t>. Результат данного действия представлен на рисунке 3.1.</w:t>
+      </w:r>
+    </w:p>
+    <w:p>
+      <w:pPr>
+        <w:spacing w:before="240" w:after="120"/>
+        <w:jc w:val="center"/>
+        <w:rPr>
+          <w:sz w:val="28"/>
+          <w:szCs w:val="28"/>
+        </w:rPr>
+      </w:pPr>
+      <w:r>
+        <w:rPr>
+          <w:sz w:val="28"/>
+          <w:szCs w:val="28"/>
+        </w:rPr>
+        <w:drawing>
+          <wp:inline distT="0" distB="0" distL="0" distR="0" wp14:anchorId="7172D159" wp14:editId="21D605D9">
+            <wp:extent cx="6372225" cy="1322705"/>
+            <wp:effectExtent l="0" t="0" r="9525" b="0"/>
+            <wp:docPr id="15" name="Рисунок 15"/>
+            <wp:cNvGraphicFramePr>
+              <a:graphicFrameLocks xmlns:a="http://schemas.openxmlformats.org/drawingml/2006/main" noChangeAspect="1"/>
+            </wp:cNvGraphicFramePr>
+            <a:graphic xmlns:a="http://schemas.openxmlformats.org/drawingml/2006/main">
+              <a:graphicData uri="http://schemas.openxmlformats.org/drawingml/2006/picture">
+                <pic:pic xmlns:pic="http://schemas.openxmlformats.org/drawingml/2006/picture">
+                  <pic:nvPicPr>
+                    <pic:cNvPr id="1" name=""/>
+                    <pic:cNvPicPr/>
+                  </pic:nvPicPr>
+                  <pic:blipFill>
+                    <a:blip r:embed="rId19"/>
+                    <a:stretch>
+                      <a:fillRect/>
+                    </a:stretch>
+                  </pic:blipFill>
+                  <pic:spPr>
+                    <a:xfrm>
+                      <a:off x="0" y="0"/>
+                      <a:ext cx="6372225" cy="1322705"/>
+                    </a:xfrm>
+                    <a:prstGeom prst="rect">
+                      <a:avLst/>
+                    </a:prstGeom>
+                  </pic:spPr>
+                </pic:pic>
+              </a:graphicData>
+            </a:graphic>
+          </wp:inline>
+        </w:drawing>
+      </w:r>
+    </w:p>
+    <w:p>
+      <w:pPr>
+        <w:spacing w:before="240" w:after="120"/>
+        <w:jc w:val="center"/>
+        <w:rPr>
+          <w:sz w:val="28"/>
+          <w:szCs w:val="28"/>
+          <w:lang w:val="en-US"/>
+        </w:rPr>
+      </w:pPr>
+      <w:r>
+        <w:rPr>
+          <w:sz w:val="28"/>
+          <w:szCs w:val="28"/>
+        </w:rPr>
+        <w:t xml:space="preserve">Рисунок 3.1 – Результат установки </w:t>
+      </w:r>
+      <w:r>
+        <w:rPr>
+          <w:sz w:val="28"/>
+          <w:szCs w:val="28"/>
+          <w:lang w:val="en-US"/>
+        </w:rPr>
+        <w:t>CMS</w:t>
+      </w:r>
+      <w:r>
+        <w:rPr>
+          <w:sz w:val="28"/>
+          <w:szCs w:val="28"/>
+        </w:rPr>
+        <w:t xml:space="preserve"> </w:t>
+      </w:r>
+      <w:r>
+        <w:rPr>
+          <w:sz w:val="28"/>
+          <w:szCs w:val="28"/>
+          <w:lang w:val="en-US"/>
+        </w:rPr>
+        <w:t>Wordpress</w:t>
+      </w:r>
+    </w:p>
+    <w:p>
+      <w:pPr>
+        <w:ind w:firstLine="708"/>
+        <w:jc w:val="both"/>
+        <w:rPr>
+          <w:sz w:val="28"/>
+          <w:szCs w:val="28"/>
+        </w:rPr>
+      </w:pPr>
+      <w:r>
+        <w:rPr>
+          <w:sz w:val="28"/>
+          <w:szCs w:val="28"/>
+        </w:rPr>
+        <w:lastRenderedPageBreak/>
+        <w:t xml:space="preserve">Теперь важно указать </w:t>
+      </w:r>
+      <w:r>
+        <w:rPr>
+          <w:sz w:val="28"/>
+          <w:szCs w:val="28"/>
+          <w:lang w:val="en-US"/>
+        </w:rPr>
+        <w:t>Apache</w:t>
+      </w:r>
+      <w:r>
+        <w:rPr>
+          <w:sz w:val="28"/>
+          <w:szCs w:val="28"/>
+        </w:rPr>
+        <w:t xml:space="preserve"> </w:t>
+      </w:r>
+      <w:r>
+        <w:rPr>
+          <w:sz w:val="28"/>
+          <w:szCs w:val="28"/>
+          <w:lang w:val="en-US"/>
+        </w:rPr>
+        <w:t>Web</w:t>
+      </w:r>
+      <w:r>
+        <w:rPr>
+          <w:sz w:val="28"/>
+          <w:szCs w:val="28"/>
+        </w:rPr>
+        <w:t xml:space="preserve"> </w:t>
+      </w:r>
+      <w:r>
+        <w:rPr>
+          <w:sz w:val="28"/>
+          <w:szCs w:val="28"/>
+          <w:lang w:val="en-US"/>
+        </w:rPr>
+        <w:t>Server</w:t>
+      </w:r>
+      <w:r>
+        <w:rPr>
+          <w:sz w:val="28"/>
+          <w:szCs w:val="28"/>
+        </w:rPr>
+        <w:t xml:space="preserve">, где он может найти ранее установленный </w:t>
+      </w:r>
+      <w:r>
+        <w:rPr>
+          <w:sz w:val="28"/>
+          <w:szCs w:val="28"/>
+          <w:lang w:val="en-US"/>
+        </w:rPr>
+        <w:t>Wordpress</w:t>
+      </w:r>
+      <w:r>
+        <w:rPr>
+          <w:sz w:val="28"/>
+          <w:szCs w:val="28"/>
+        </w:rPr>
+        <w:t>. Для этого создадим конфигурационный файл. Он представлен на рисунке 3.2.</w:t>
+      </w:r>
+    </w:p>
+    <w:p>
+      <w:pPr>
+        <w:spacing w:before="240" w:after="120"/>
+        <w:jc w:val="center"/>
+        <w:rPr>
+          <w:sz w:val="28"/>
+          <w:szCs w:val="28"/>
+        </w:rPr>
+      </w:pPr>
+      <w:r>
+        <w:rPr>
+          <w:sz w:val="28"/>
+          <w:szCs w:val="28"/>
+        </w:rPr>
+        <w:drawing>
+          <wp:inline distT="0" distB="0" distL="0" distR="0" wp14:anchorId="4D3C71E3" wp14:editId="22E9E0AB">
+            <wp:extent cx="4544059" cy="2257740"/>
+            <wp:effectExtent l="0" t="0" r="9525" b="9525"/>
+            <wp:docPr id="16" name="Рисунок 16"/>
+            <wp:cNvGraphicFramePr>
+              <a:graphicFrameLocks xmlns:a="http://schemas.openxmlformats.org/drawingml/2006/main" noChangeAspect="1"/>
+            </wp:cNvGraphicFramePr>
+            <a:graphic xmlns:a="http://schemas.openxmlformats.org/drawingml/2006/main">
+              <a:graphicData uri="http://schemas.openxmlformats.org/drawingml/2006/picture">
+                <pic:pic xmlns:pic="http://schemas.openxmlformats.org/drawingml/2006/picture">
+                  <pic:nvPicPr>
+                    <pic:cNvPr id="1" name=""/>
+                    <pic:cNvPicPr/>
+                  </pic:nvPicPr>
+                  <pic:blipFill>
+                    <a:blip r:embed="rId20"/>
+                    <a:stretch>
+                      <a:fillRect/>
+                    </a:stretch>
+                  </pic:blipFill>
+                  <pic:spPr>
+                    <a:xfrm>
+                      <a:off x="0" y="0"/>
+                      <a:ext cx="4544059" cy="2257740"/>
+                    </a:xfrm>
+                    <a:prstGeom prst="rect">
+                      <a:avLst/>
+                    </a:prstGeom>
+                  </pic:spPr>
+                </pic:pic>
+              </a:graphicData>
+            </a:graphic>
+          </wp:inline>
+        </w:drawing>
+      </w:r>
+    </w:p>
+    <w:p>
+      <w:pPr>
+        <w:jc w:val="center"/>
+        <w:rPr>
+          <w:sz w:val="28"/>
+          <w:szCs w:val="28"/>
+          <w:lang w:val="en-US"/>
+        </w:rPr>
+      </w:pPr>
+      <w:r>
+        <w:rPr>
+          <w:sz w:val="28"/>
+          <w:szCs w:val="28"/>
+        </w:rPr>
+        <w:t xml:space="preserve">Рисунок 3.2 – Конфигурационный файл, связывающий </w:t>
+      </w:r>
+      <w:r>
+        <w:rPr>
+          <w:sz w:val="28"/>
+          <w:szCs w:val="28"/>
+          <w:lang w:val="en-US"/>
+        </w:rPr>
+        <w:t>Apache</w:t>
+      </w:r>
+      <w:r>
+        <w:rPr>
+          <w:sz w:val="28"/>
+          <w:szCs w:val="28"/>
+        </w:rPr>
+        <w:t>2</w:t>
+      </w:r>
+      <w:r>
+        <w:rPr>
+          <w:sz w:val="28"/>
+          <w:szCs w:val="28"/>
+        </w:rPr>
+        <w:t xml:space="preserve"> </w:t>
+      </w:r>
+      <w:r>
+        <w:rPr>
+          <w:sz w:val="28"/>
+          <w:szCs w:val="28"/>
+        </w:rPr>
+        <w:t xml:space="preserve">с </w:t>
+      </w:r>
+      <w:r>
+        <w:rPr>
+          <w:sz w:val="28"/>
+          <w:szCs w:val="28"/>
+          <w:lang w:val="en-US"/>
+        </w:rPr>
+        <w:t>Wordpress</w:t>
+      </w:r>
+    </w:p>
+    <w:p>
+      <w:pPr>
+        <w:spacing w:before="240"/>
+        <w:ind w:firstLine="708"/>
+        <w:jc w:val="both"/>
+        <w:rPr>
+          <w:sz w:val="28"/>
+          <w:szCs w:val="28"/>
+        </w:rPr>
+      </w:pPr>
+      <w:r>
+        <w:rPr>
+          <w:sz w:val="28"/>
+          <w:szCs w:val="28"/>
+        </w:rPr>
+        <w:t xml:space="preserve">Следующим шагом применим изменения, включим </w:t>
+      </w:r>
+      <w:r>
+        <w:rPr>
+          <w:sz w:val="28"/>
+          <w:szCs w:val="28"/>
+          <w:lang w:val="en-US"/>
+        </w:rPr>
+        <w:t>Wordpress</w:t>
+      </w:r>
+      <w:r>
+        <w:rPr>
+          <w:sz w:val="28"/>
+          <w:szCs w:val="28"/>
+        </w:rPr>
+        <w:t xml:space="preserve"> с помощью команды </w:t>
+      </w:r>
+      <w:r>
+        <w:rPr>
+          <w:sz w:val="28"/>
+          <w:szCs w:val="28"/>
+          <w:lang w:val="en-US"/>
+        </w:rPr>
+        <w:t>a</w:t>
+      </w:r>
+      <w:r>
+        <w:rPr>
+          <w:sz w:val="28"/>
+          <w:szCs w:val="28"/>
+        </w:rPr>
+        <w:t>2</w:t>
+      </w:r>
+      <w:proofErr w:type="spellStart"/>
+      <w:r>
+        <w:rPr>
+          <w:sz w:val="28"/>
+          <w:szCs w:val="28"/>
+          <w:lang w:val="en-US"/>
+        </w:rPr>
+        <w:t>ensite</w:t>
+      </w:r>
+      <w:proofErr w:type="spellEnd"/>
+      <w:r>
+        <w:rPr>
+          <w:sz w:val="28"/>
+          <w:szCs w:val="28"/>
+        </w:rPr>
+        <w:t xml:space="preserve"> </w:t>
+      </w:r>
+      <w:r>
+        <w:rPr>
+          <w:sz w:val="28"/>
+          <w:szCs w:val="28"/>
+        </w:rPr>
+        <w:t xml:space="preserve">и перезапустим службу </w:t>
+      </w:r>
+      <w:proofErr w:type="spellStart"/>
+      <w:r>
+        <w:rPr>
+          <w:sz w:val="28"/>
+          <w:szCs w:val="28"/>
+          <w:lang w:val="en-US"/>
+        </w:rPr>
+        <w:t>apache</w:t>
+      </w:r>
+      <w:proofErr w:type="spellEnd"/>
+      <w:r>
+        <w:rPr>
+          <w:sz w:val="28"/>
+          <w:szCs w:val="28"/>
+        </w:rPr>
+        <w:t xml:space="preserve">2. </w:t>
+      </w:r>
+      <w:r>
+        <w:rPr>
+          <w:sz w:val="28"/>
+          <w:szCs w:val="28"/>
+        </w:rPr>
+        <w:t>Результат данных действий представлен на рисунке 3.3.</w:t>
+      </w:r>
+    </w:p>
+    <w:p>
+      <w:pPr>
+        <w:spacing w:before="240" w:after="120"/>
+        <w:jc w:val="center"/>
+        <w:rPr>
+          <w:sz w:val="28"/>
+          <w:szCs w:val="28"/>
+        </w:rPr>
+      </w:pPr>
+      <w:r>
+        <w:rPr>
+          <w:sz w:val="28"/>
+          <w:szCs w:val="28"/>
+        </w:rPr>
+        <w:drawing>
+          <wp:inline distT="0" distB="0" distL="0" distR="0" wp14:anchorId="08B2EC0E" wp14:editId="531699A5">
+            <wp:extent cx="5496692" cy="1848108"/>
+            <wp:effectExtent l="0" t="0" r="8890" b="0"/>
+            <wp:docPr id="17" name="Рисунок 17"/>
+            <wp:cNvGraphicFramePr>
+              <a:graphicFrameLocks xmlns:a="http://schemas.openxmlformats.org/drawingml/2006/main" noChangeAspect="1"/>
+            </wp:cNvGraphicFramePr>
+            <a:graphic xmlns:a="http://schemas.openxmlformats.org/drawingml/2006/main">
+              <a:graphicData uri="http://schemas.openxmlformats.org/drawingml/2006/picture">
+                <pic:pic xmlns:pic="http://schemas.openxmlformats.org/drawingml/2006/picture">
+                  <pic:nvPicPr>
+                    <pic:cNvPr id="1" name=""/>
+                    <pic:cNvPicPr/>
+                  </pic:nvPicPr>
+                  <pic:blipFill>
+                    <a:blip r:embed="rId21"/>
+                    <a:stretch>
+                      <a:fillRect/>
+                    </a:stretch>
+                  </pic:blipFill>
+                  <pic:spPr>
+                    <a:xfrm>
+                      <a:off x="0" y="0"/>
+                      <a:ext cx="5496692" cy="1848108"/>
+                    </a:xfrm>
+                    <a:prstGeom prst="rect">
+                      <a:avLst/>
+                    </a:prstGeom>
+                  </pic:spPr>
+                </pic:pic>
+              </a:graphicData>
+            </a:graphic>
+          </wp:inline>
+        </w:drawing>
+      </w:r>
+    </w:p>
+    <w:p>
+      <w:pPr>
+        <w:jc w:val="center"/>
+        <w:rPr>
+          <w:sz w:val="28"/>
+          <w:szCs w:val="28"/>
+        </w:rPr>
+      </w:pPr>
+      <w:r>
+        <w:rPr>
+          <w:sz w:val="28"/>
+          <w:szCs w:val="28"/>
+        </w:rPr>
+        <w:t>Рисунок 3.3 – Результат применения ранее созданной конфигурации</w:t>
+      </w:r>
+    </w:p>
+    <w:p>
+      <w:pPr>
+        <w:spacing w:before="240"/>
+        <w:ind w:firstLine="708"/>
+        <w:jc w:val="both"/>
+        <w:rPr>
+          <w:sz w:val="28"/>
+          <w:szCs w:val="28"/>
+        </w:rPr>
+      </w:pPr>
+      <w:r>
+        <w:rPr>
+          <w:sz w:val="28"/>
+          <w:szCs w:val="28"/>
+        </w:rPr>
+        <w:t xml:space="preserve">Далее для работы </w:t>
+      </w:r>
+      <w:r>
+        <w:rPr>
+          <w:sz w:val="28"/>
+          <w:szCs w:val="28"/>
+          <w:lang w:val="en-US"/>
+        </w:rPr>
+        <w:t>Wordpress</w:t>
+      </w:r>
+      <w:r>
+        <w:rPr>
+          <w:sz w:val="28"/>
+          <w:szCs w:val="28"/>
+        </w:rPr>
+        <w:t xml:space="preserve"> </w:t>
+      </w:r>
+      <w:r>
+        <w:rPr>
+          <w:sz w:val="28"/>
+          <w:szCs w:val="28"/>
+        </w:rPr>
+        <w:t>необходимо создать соответствующую БД и пользователя для неё, после чего создать и отредактировать конфигурационный файл для нашего сайта. Данный файл представлен на рисунке 3.4.</w:t>
+      </w:r>
+    </w:p>
+    <w:p>
+      <w:pPr>
+        <w:spacing w:before="240" w:after="120"/>
+        <w:jc w:val="center"/>
+        <w:rPr>
+          <w:sz w:val="28"/>
+          <w:szCs w:val="28"/>
+        </w:rPr>
+      </w:pPr>
+      <w:r>
+        <w:rPr>
+          <w:sz w:val="28"/>
+          <w:szCs w:val="28"/>
+        </w:rPr>
+        <w:drawing>
+          <wp:inline distT="0" distB="0" distL="0" distR="0" wp14:anchorId="46E51C05" wp14:editId="748181A9">
+            <wp:extent cx="4152900" cy="1762551"/>
+            <wp:effectExtent l="0" t="0" r="0" b="9525"/>
+            <wp:docPr id="18" name="Рисунок 18"/>
+            <wp:cNvGraphicFramePr>
+              <a:graphicFrameLocks xmlns:a="http://schemas.openxmlformats.org/drawingml/2006/main" noChangeAspect="1"/>
+            </wp:cNvGraphicFramePr>
+            <a:graphic xmlns:a="http://schemas.openxmlformats.org/drawingml/2006/main">
+              <a:graphicData uri="http://schemas.openxmlformats.org/drawingml/2006/picture">
+                <pic:pic xmlns:pic="http://schemas.openxmlformats.org/drawingml/2006/picture">
+                  <pic:nvPicPr>
+                    <pic:cNvPr id="1" name=""/>
+                    <pic:cNvPicPr/>
+                  </pic:nvPicPr>
+                  <pic:blipFill>
+                    <a:blip r:embed="rId22"/>
+                    <a:stretch>
+                      <a:fillRect/>
+                    </a:stretch>
+                  </pic:blipFill>
+                  <pic:spPr>
+                    <a:xfrm>
+                      <a:off x="0" y="0"/>
+                      <a:ext cx="4179986" cy="1774047"/>
+                    </a:xfrm>
+                    <a:prstGeom prst="rect">
+                      <a:avLst/>
+                    </a:prstGeom>
+                  </pic:spPr>
+                </pic:pic>
+              </a:graphicData>
+            </a:graphic>
+          </wp:inline>
+        </w:drawing>
+      </w:r>
+    </w:p>
+    <w:p>
+      <w:pPr>
+        <w:jc w:val="center"/>
+        <w:rPr>
+          <w:sz w:val="28"/>
+          <w:szCs w:val="28"/>
+          <w:lang w:val="en-US"/>
+        </w:rPr>
+      </w:pPr>
+      <w:r>
+        <w:rPr>
+          <w:sz w:val="28"/>
+          <w:szCs w:val="28"/>
+        </w:rPr>
+        <w:t xml:space="preserve">Рисунок 3.4 – Конфигурационный файл для </w:t>
+      </w:r>
+      <w:r>
+        <w:rPr>
+          <w:sz w:val="28"/>
+          <w:szCs w:val="28"/>
+          <w:lang w:val="en-US"/>
+        </w:rPr>
+        <w:t>Wordpress</w:t>
+      </w:r>
+      <w:r>
+        <w:rPr>
+          <w:sz w:val="28"/>
+          <w:szCs w:val="28"/>
+        </w:rPr>
+        <w:t xml:space="preserve"> и</w:t>
+      </w:r>
+      <w:r>
+        <w:rPr>
+          <w:sz w:val="28"/>
+          <w:szCs w:val="28"/>
+        </w:rPr>
+        <w:t xml:space="preserve"> </w:t>
+      </w:r>
+      <w:r>
+        <w:rPr>
+          <w:sz w:val="28"/>
+          <w:szCs w:val="28"/>
+          <w:lang w:val="en-US"/>
+        </w:rPr>
+        <w:t>site</w:t>
+      </w:r>
+      <w:r>
+        <w:rPr>
+          <w:sz w:val="28"/>
+          <w:szCs w:val="28"/>
+        </w:rPr>
+        <w:t>.</w:t>
+      </w:r>
+      <w:proofErr w:type="spellStart"/>
+      <w:r>
+        <w:rPr>
+          <w:sz w:val="28"/>
+          <w:szCs w:val="28"/>
+          <w:lang w:val="en-US"/>
+        </w:rPr>
+        <w:t>Filipiuk</w:t>
+      </w:r>
+      <w:proofErr w:type="spellEnd"/>
+      <w:r>
+        <w:rPr>
+          <w:sz w:val="28"/>
+          <w:szCs w:val="28"/>
+        </w:rPr>
+        <w:t>.</w:t>
+      </w:r>
+      <w:r>
+        <w:rPr>
+          <w:sz w:val="28"/>
+          <w:szCs w:val="28"/>
+          <w:lang w:val="en-US"/>
+        </w:rPr>
+        <w:t>by</w:t>
+      </w:r>
+    </w:p>
+    <w:p>
+      <w:pPr>
+        <w:ind w:firstLine="708"/>
+        <w:jc w:val="both"/>
+        <w:rPr>
+          <w:sz w:val="28"/>
+          <w:szCs w:val="28"/>
+        </w:rPr>
+      </w:pPr>
+      <w:r>
+        <w:rPr>
+          <w:sz w:val="28"/>
+          <w:szCs w:val="28"/>
+        </w:rPr>
+        <w:lastRenderedPageBreak/>
+        <w:t xml:space="preserve">Далее отредактируем конфигурационный файл виртуального хоста для </w:t>
+      </w:r>
+      <w:r>
+        <w:rPr>
+          <w:sz w:val="28"/>
+          <w:szCs w:val="28"/>
+          <w:lang w:val="en-US"/>
+        </w:rPr>
+        <w:t>site</w:t>
+      </w:r>
+      <w:r>
+        <w:rPr>
+          <w:sz w:val="28"/>
+          <w:szCs w:val="28"/>
+        </w:rPr>
+        <w:t>.</w:t>
+      </w:r>
+      <w:proofErr w:type="spellStart"/>
+      <w:r>
+        <w:rPr>
+          <w:sz w:val="28"/>
+          <w:szCs w:val="28"/>
+          <w:lang w:val="en-US"/>
+        </w:rPr>
+        <w:t>Filipiuk</w:t>
+      </w:r>
+      <w:proofErr w:type="spellEnd"/>
+      <w:r>
+        <w:rPr>
+          <w:sz w:val="28"/>
+          <w:szCs w:val="28"/>
+        </w:rPr>
+        <w:t>.</w:t>
+      </w:r>
+      <w:r>
+        <w:rPr>
+          <w:sz w:val="28"/>
+          <w:szCs w:val="28"/>
+          <w:lang w:val="en-US"/>
+        </w:rPr>
+        <w:t>by</w:t>
+      </w:r>
+      <w:r>
+        <w:rPr>
+          <w:sz w:val="28"/>
+          <w:szCs w:val="28"/>
+        </w:rPr>
+        <w:t xml:space="preserve">, заново переведём его в состояние </w:t>
+      </w:r>
+      <w:r>
+        <w:rPr>
+          <w:sz w:val="28"/>
+          <w:szCs w:val="28"/>
+          <w:lang w:val="en-US"/>
+        </w:rPr>
+        <w:t>enabled</w:t>
+      </w:r>
+      <w:r>
+        <w:rPr>
+          <w:sz w:val="28"/>
+          <w:szCs w:val="28"/>
+        </w:rPr>
+        <w:t xml:space="preserve"> </w:t>
+      </w:r>
+      <w:r>
+        <w:rPr>
+          <w:sz w:val="28"/>
+          <w:szCs w:val="28"/>
+        </w:rPr>
+        <w:t xml:space="preserve">и перезапустим службу </w:t>
+      </w:r>
+      <w:proofErr w:type="spellStart"/>
+      <w:r>
+        <w:rPr>
+          <w:sz w:val="28"/>
+          <w:szCs w:val="28"/>
+          <w:lang w:val="en-US"/>
+        </w:rPr>
+        <w:t>apache</w:t>
+      </w:r>
+      <w:proofErr w:type="spellEnd"/>
+      <w:r>
+        <w:rPr>
+          <w:sz w:val="28"/>
+          <w:szCs w:val="28"/>
+        </w:rPr>
+        <w:t xml:space="preserve">2. </w:t>
+      </w:r>
+      <w:r>
+        <w:rPr>
+          <w:sz w:val="28"/>
+          <w:szCs w:val="28"/>
+        </w:rPr>
+        <w:t>Результат данных действий представлен на рисунке 3.5.</w:t>
+      </w:r>
+    </w:p>
+    <w:p>
+      <w:pPr>
+        <w:spacing w:before="240" w:after="120"/>
+        <w:jc w:val="center"/>
+        <w:rPr>
+          <w:sz w:val="28"/>
+          <w:szCs w:val="28"/>
+        </w:rPr>
+      </w:pPr>
+      <w:r>
+        <w:rPr>
+          <w:sz w:val="28"/>
+          <w:szCs w:val="28"/>
+        </w:rPr>
+        <w:drawing>
+          <wp:inline distT="0" distB="0" distL="0" distR="0" wp14:anchorId="76D79767" wp14:editId="47D83198">
+            <wp:extent cx="5953956" cy="1276528"/>
+            <wp:effectExtent l="0" t="0" r="8890" b="0"/>
+            <wp:docPr id="19" name="Рисунок 19"/>
+            <wp:cNvGraphicFramePr>
+              <a:graphicFrameLocks xmlns:a="http://schemas.openxmlformats.org/drawingml/2006/main" noChangeAspect="1"/>
+            </wp:cNvGraphicFramePr>
+            <a:graphic xmlns:a="http://schemas.openxmlformats.org/drawingml/2006/main">
+              <a:graphicData uri="http://schemas.openxmlformats.org/drawingml/2006/picture">
+                <pic:pic xmlns:pic="http://schemas.openxmlformats.org/drawingml/2006/picture">
+                  <pic:nvPicPr>
+                    <pic:cNvPr id="1" name=""/>
+                    <pic:cNvPicPr/>
+                  </pic:nvPicPr>
+                  <pic:blipFill>
+                    <a:blip r:embed="rId23"/>
+                    <a:stretch>
+                      <a:fillRect/>
+                    </a:stretch>
+                  </pic:blipFill>
+                  <pic:spPr>
+                    <a:xfrm>
+                      <a:off x="0" y="0"/>
+                      <a:ext cx="5953956" cy="1276528"/>
+                    </a:xfrm>
+                    <a:prstGeom prst="rect">
+                      <a:avLst/>
+                    </a:prstGeom>
+                  </pic:spPr>
+                </pic:pic>
+              </a:graphicData>
+            </a:graphic>
+          </wp:inline>
+        </w:drawing>
+      </w:r>
+    </w:p>
+    <w:p>
+      <w:pPr>
+        <w:jc w:val="center"/>
+        <w:rPr>
+          <w:sz w:val="28"/>
+          <w:szCs w:val="28"/>
+        </w:rPr>
+      </w:pPr>
+      <w:r>
+        <w:rPr>
+          <w:sz w:val="28"/>
+          <w:szCs w:val="28"/>
+        </w:rPr>
+        <w:t>Рисунок 3.5 – Перезагрузка виртуального хоста после редактирования конфигурационного файла</w:t>
+      </w:r>
+    </w:p>
+    <w:p>
+      <w:pPr>
+        <w:spacing w:before="240"/>
+        <w:ind w:firstLine="708"/>
+        <w:jc w:val="both"/>
+        <w:rPr>
+          <w:sz w:val="28"/>
+          <w:szCs w:val="28"/>
+        </w:rPr>
+      </w:pPr>
+      <w:r>
+        <w:rPr>
+          <w:sz w:val="28"/>
+          <w:szCs w:val="28"/>
+        </w:rPr>
+        <w:t xml:space="preserve">После этого нужно зайти на </w:t>
+      </w:r>
+      <w:hyperlink r:id="rId24" w:history="1">
+        <w:r>
+          <w:rPr>
+            <w:rStyle w:val="a4"/>
+            <w:sz w:val="28"/>
+            <w:szCs w:val="28"/>
+            <w:lang w:val="en-US"/>
+          </w:rPr>
+          <w:t>http</w:t>
+        </w:r>
+        <w:r>
+          <w:rPr>
+            <w:rStyle w:val="a4"/>
+            <w:sz w:val="28"/>
+            <w:szCs w:val="28"/>
+          </w:rPr>
+          <w:t>://</w:t>
+        </w:r>
+        <w:r>
+          <w:rPr>
+            <w:rStyle w:val="a4"/>
+            <w:sz w:val="28"/>
+            <w:szCs w:val="28"/>
+            <w:lang w:val="en-US"/>
+          </w:rPr>
+          <w:t>site</w:t>
+        </w:r>
+        <w:r>
+          <w:rPr>
+            <w:rStyle w:val="a4"/>
+            <w:sz w:val="28"/>
+            <w:szCs w:val="28"/>
+          </w:rPr>
+          <w:t>.</w:t>
+        </w:r>
+        <w:proofErr w:type="spellStart"/>
+        <w:r>
+          <w:rPr>
+            <w:rStyle w:val="a4"/>
+            <w:sz w:val="28"/>
+            <w:szCs w:val="28"/>
+            <w:lang w:val="en-US"/>
+          </w:rPr>
+          <w:t>filipiuk</w:t>
+        </w:r>
+        <w:proofErr w:type="spellEnd"/>
+        <w:r>
+          <w:rPr>
+            <w:rStyle w:val="a4"/>
+            <w:sz w:val="28"/>
+            <w:szCs w:val="28"/>
+          </w:rPr>
+          <w:t>.</w:t>
+        </w:r>
+        <w:r>
+          <w:rPr>
+            <w:rStyle w:val="a4"/>
+            <w:sz w:val="28"/>
+            <w:szCs w:val="28"/>
+            <w:lang w:val="en-US"/>
+          </w:rPr>
+          <w:t>by</w:t>
+        </w:r>
+      </w:hyperlink>
+      <w:r>
+        <w:rPr>
+          <w:sz w:val="28"/>
+          <w:szCs w:val="28"/>
+        </w:rPr>
+        <w:t xml:space="preserve"> </w:t>
+      </w:r>
+      <w:r>
+        <w:rPr>
+          <w:sz w:val="28"/>
+          <w:szCs w:val="28"/>
+        </w:rPr>
+        <w:t xml:space="preserve">в браузере. При выполнении данного действия появится страница установки </w:t>
+      </w:r>
+      <w:r>
+        <w:rPr>
+          <w:sz w:val="28"/>
+          <w:szCs w:val="28"/>
+          <w:lang w:val="en-US"/>
+        </w:rPr>
+        <w:t>Wordpress</w:t>
+      </w:r>
+      <w:r>
+        <w:rPr>
+          <w:sz w:val="28"/>
+          <w:szCs w:val="28"/>
+        </w:rPr>
+        <w:t xml:space="preserve">. </w:t>
+      </w:r>
+      <w:r>
+        <w:rPr>
+          <w:sz w:val="28"/>
+          <w:szCs w:val="28"/>
+        </w:rPr>
+        <w:t>Необходимо выполнить начальные настройки и установить. Результат представлен на рисунке 3.6.</w:t>
+      </w:r>
+    </w:p>
+    <w:p>
+      <w:pPr>
+        <w:spacing w:before="240" w:after="120"/>
+        <w:jc w:val="center"/>
+        <w:rPr>
+          <w:sz w:val="28"/>
+          <w:szCs w:val="28"/>
+        </w:rPr>
+      </w:pPr>
+      <w:r>
+        <w:rPr>
+          <w:sz w:val="28"/>
+          <w:szCs w:val="28"/>
+        </w:rPr>
+        <w:drawing>
+          <wp:inline distT="0" distB="0" distL="0" distR="0" wp14:anchorId="66637C28" wp14:editId="29B3C36E">
+            <wp:extent cx="6372225" cy="3940175"/>
+            <wp:effectExtent l="0" t="0" r="9525" b="3175"/>
+            <wp:docPr id="20" name="Рисунок 20"/>
+            <wp:cNvGraphicFramePr>
+              <a:graphicFrameLocks xmlns:a="http://schemas.openxmlformats.org/drawingml/2006/main" noChangeAspect="1"/>
+            </wp:cNvGraphicFramePr>
+            <a:graphic xmlns:a="http://schemas.openxmlformats.org/drawingml/2006/main">
+              <a:graphicData uri="http://schemas.openxmlformats.org/drawingml/2006/picture">
+                <pic:pic xmlns:pic="http://schemas.openxmlformats.org/drawingml/2006/picture">
+                  <pic:nvPicPr>
+                    <pic:cNvPr id="1" name=""/>
+                    <pic:cNvPicPr/>
+                  </pic:nvPicPr>
+                  <pic:blipFill>
+                    <a:blip r:embed="rId25"/>
+                    <a:stretch>
+                      <a:fillRect/>
+                    </a:stretch>
+                  </pic:blipFill>
+                  <pic:spPr>
+                    <a:xfrm>
+                      <a:off x="0" y="0"/>
+                      <a:ext cx="6372225" cy="3940175"/>
+                    </a:xfrm>
+                    <a:prstGeom prst="rect">
+                      <a:avLst/>
+                    </a:prstGeom>
+                  </pic:spPr>
+                </pic:pic>
+              </a:graphicData>
+            </a:graphic>
+          </wp:inline>
+        </w:drawing>
+      </w:r>
+    </w:p>
+    <w:p>
+      <w:pPr>
+        <w:jc w:val="center"/>
+        <w:rPr>
+          <w:sz w:val="28"/>
+          <w:szCs w:val="28"/>
+        </w:rPr>
+      </w:pPr>
+      <w:r>
+        <w:rPr>
+          <w:sz w:val="28"/>
+          <w:szCs w:val="28"/>
+        </w:rPr>
+        <w:t xml:space="preserve">Рисунок 3.6. – Результат установки </w:t>
+      </w:r>
+      <w:r>
+        <w:rPr>
+          <w:sz w:val="28"/>
+          <w:szCs w:val="28"/>
+          <w:lang w:val="en-US"/>
+        </w:rPr>
+        <w:t>Wordpress</w:t>
+      </w:r>
+      <w:r>
+        <w:rPr>
+          <w:sz w:val="28"/>
+          <w:szCs w:val="28"/>
+        </w:rPr>
+        <w:t xml:space="preserve"> </w:t>
+      </w:r>
+      <w:r>
+        <w:rPr>
+          <w:sz w:val="28"/>
+          <w:szCs w:val="28"/>
+        </w:rPr>
+        <w:t>в браузере</w:t>
+      </w:r>
+    </w:p>
+    <w:p>
+      <w:pPr>
+        <w:spacing w:before="240"/>
+        <w:ind w:firstLine="708"/>
+        <w:jc w:val="both"/>
+        <w:rPr>
+          <w:sz w:val="28"/>
+          <w:szCs w:val="28"/>
+        </w:rPr>
+      </w:pPr>
+      <w:r>
+        <w:rPr>
+          <w:sz w:val="28"/>
+          <w:szCs w:val="28"/>
+        </w:rPr>
+        <w:t>После</w:t>
+      </w:r>
+      <w:r>
+        <w:rPr>
+          <w:sz w:val="28"/>
+          <w:szCs w:val="28"/>
+        </w:rPr>
+        <w:t xml:space="preserve"> </w:t>
+      </w:r>
+      <w:r>
+        <w:rPr>
+          <w:sz w:val="28"/>
+          <w:szCs w:val="28"/>
+        </w:rPr>
+        <w:t>этого</w:t>
+      </w:r>
+      <w:r>
+        <w:rPr>
+          <w:sz w:val="28"/>
+          <w:szCs w:val="28"/>
+        </w:rPr>
+        <w:t xml:space="preserve"> </w:t>
+      </w:r>
+      <w:r>
+        <w:rPr>
+          <w:sz w:val="28"/>
+          <w:szCs w:val="28"/>
+        </w:rPr>
+        <w:t>с</w:t>
+      </w:r>
+      <w:r>
+        <w:rPr>
+          <w:sz w:val="28"/>
+          <w:szCs w:val="28"/>
+        </w:rPr>
+        <w:t xml:space="preserve"> </w:t>
+      </w:r>
+      <w:r>
+        <w:rPr>
+          <w:sz w:val="28"/>
+          <w:szCs w:val="28"/>
+          <w:lang w:val="en-US"/>
+        </w:rPr>
+        <w:t>Wordpress</w:t>
+      </w:r>
+      <w:r>
+        <w:rPr>
+          <w:sz w:val="28"/>
+          <w:szCs w:val="28"/>
+        </w:rPr>
+        <w:t xml:space="preserve"> </w:t>
+      </w:r>
+      <w:r>
+        <w:rPr>
+          <w:sz w:val="28"/>
+          <w:szCs w:val="28"/>
+          <w:lang w:val="en-US"/>
+        </w:rPr>
+        <w:t>Theme</w:t>
+      </w:r>
+      <w:r>
+        <w:rPr>
+          <w:sz w:val="28"/>
+          <w:szCs w:val="28"/>
+        </w:rPr>
+        <w:t xml:space="preserve"> </w:t>
+      </w:r>
+      <w:r>
+        <w:rPr>
+          <w:sz w:val="28"/>
+          <w:szCs w:val="28"/>
+          <w:lang w:val="en-US"/>
+        </w:rPr>
+        <w:t>Directory</w:t>
+      </w:r>
+      <w:r>
+        <w:rPr>
+          <w:sz w:val="28"/>
+          <w:szCs w:val="28"/>
+        </w:rPr>
+        <w:t xml:space="preserve"> </w:t>
+      </w:r>
+      <w:r>
+        <w:rPr>
+          <w:sz w:val="28"/>
+          <w:szCs w:val="28"/>
+        </w:rPr>
+        <w:t>скачаем</w:t>
+      </w:r>
+      <w:r>
+        <w:rPr>
+          <w:sz w:val="28"/>
+          <w:szCs w:val="28"/>
+        </w:rPr>
+        <w:t xml:space="preserve"> </w:t>
+      </w:r>
+      <w:r>
+        <w:rPr>
+          <w:sz w:val="28"/>
+          <w:szCs w:val="28"/>
+        </w:rPr>
+        <w:t xml:space="preserve">новую тему для </w:t>
+      </w:r>
+      <w:r>
+        <w:rPr>
+          <w:sz w:val="28"/>
+          <w:szCs w:val="28"/>
+          <w:lang w:val="en-US"/>
+        </w:rPr>
+        <w:t>Wordpress</w:t>
+      </w:r>
+      <w:r>
+        <w:rPr>
+          <w:sz w:val="28"/>
+          <w:szCs w:val="28"/>
+        </w:rPr>
+        <w:t xml:space="preserve"> и с помощью ранее установленного </w:t>
+      </w:r>
+      <w:r>
+        <w:rPr>
+          <w:sz w:val="28"/>
+          <w:szCs w:val="28"/>
+          <w:lang w:val="en-US"/>
+        </w:rPr>
+        <w:t>FTP</w:t>
+      </w:r>
+      <w:r>
+        <w:rPr>
+          <w:sz w:val="28"/>
+          <w:szCs w:val="28"/>
+        </w:rPr>
+        <w:t>-</w:t>
+      </w:r>
+      <w:r>
+        <w:rPr>
+          <w:sz w:val="28"/>
+          <w:szCs w:val="28"/>
+        </w:rPr>
+        <w:t xml:space="preserve">клиента перенесём архив с темой в папку </w:t>
+      </w:r>
+      <w:r>
+        <w:rPr>
+          <w:sz w:val="28"/>
+          <w:szCs w:val="28"/>
+          <w:lang w:val="en-US"/>
+        </w:rPr>
+        <w:t>FTP</w:t>
+      </w:r>
+      <w:r>
+        <w:rPr>
+          <w:sz w:val="28"/>
+          <w:szCs w:val="28"/>
+        </w:rPr>
+        <w:t>-</w:t>
+      </w:r>
+      <w:r>
+        <w:rPr>
+          <w:sz w:val="28"/>
+          <w:szCs w:val="28"/>
+        </w:rPr>
+        <w:t>пользователя, после чего убедимся в наличии файла в конечной директории (рисунок 3.7).</w:t>
+      </w:r>
+    </w:p>
+    <w:p>
+      <w:pPr>
+        <w:spacing w:before="240" w:after="120"/>
+        <w:jc w:val="center"/>
+        <w:rPr>
+          <w:sz w:val="28"/>
+          <w:szCs w:val="28"/>
+        </w:rPr>
+      </w:pPr>
+      <w:r>
+        <w:rPr>
+          <w:sz w:val="28"/>
+          <w:szCs w:val="28"/>
+        </w:rPr>
+        <w:lastRenderedPageBreak/>
+        <w:drawing>
+          <wp:inline distT="0" distB="0" distL="0" distR="0" wp14:anchorId="795F0E51" wp14:editId="4EB52B8A">
+            <wp:extent cx="3534268" cy="695422"/>
+            <wp:effectExtent l="0" t="0" r="9525" b="9525"/>
+            <wp:docPr id="25" name="Рисунок 25"/>
+            <wp:cNvGraphicFramePr>
+              <a:graphicFrameLocks xmlns:a="http://schemas.openxmlformats.org/drawingml/2006/main" noChangeAspect="1"/>
+            </wp:cNvGraphicFramePr>
+            <a:graphic xmlns:a="http://schemas.openxmlformats.org/drawingml/2006/main">
+              <a:graphicData uri="http://schemas.openxmlformats.org/drawingml/2006/picture">
+                <pic:pic xmlns:pic="http://schemas.openxmlformats.org/drawingml/2006/picture">
+                  <pic:nvPicPr>
+                    <pic:cNvPr id="1" name=""/>
+                    <pic:cNvPicPr/>
+                  </pic:nvPicPr>
+                  <pic:blipFill>
+                    <a:blip r:embed="rId26"/>
+                    <a:stretch>
+                      <a:fillRect/>
+                    </a:stretch>
+                  </pic:blipFill>
+                  <pic:spPr>
+                    <a:xfrm>
+                      <a:off x="0" y="0"/>
+                      <a:ext cx="3534268" cy="695422"/>
+                    </a:xfrm>
+                    <a:prstGeom prst="rect">
+                      <a:avLst/>
+                    </a:prstGeom>
+                  </pic:spPr>
+                </pic:pic>
+              </a:graphicData>
+            </a:graphic>
+          </wp:inline>
+        </w:drawing>
+      </w:r>
+    </w:p>
+    <w:p>
+      <w:pPr>
+        <w:rPr>
+          <w:sz w:val="28"/>
+          <w:szCs w:val="28"/>
+        </w:rPr>
+      </w:pPr>
+      <w:r>
+        <w:rPr>
+          <w:sz w:val="28"/>
+          <w:szCs w:val="28"/>
+        </w:rPr>
+        <w:t xml:space="preserve">Рисунок 3.7 – Результат проверки наличия файла в директории </w:t>
+      </w:r>
+      <w:r>
+        <w:rPr>
+          <w:sz w:val="28"/>
+          <w:szCs w:val="28"/>
+          <w:lang w:val="en-US"/>
+        </w:rPr>
+        <w:t>FTP</w:t>
+      </w:r>
+      <w:r>
+        <w:rPr>
+          <w:sz w:val="28"/>
+          <w:szCs w:val="28"/>
+        </w:rPr>
+        <w:t>-пользователя</w:t>
+      </w:r>
+    </w:p>
+    <w:p>
+      <w:pPr>
+        <w:spacing w:before="240"/>
+        <w:ind w:firstLine="708"/>
+        <w:jc w:val="both"/>
+        <w:rPr>
+          <w:sz w:val="28"/>
+          <w:szCs w:val="28"/>
+        </w:rPr>
+      </w:pPr>
+      <w:r>
+        <w:rPr>
+          <w:sz w:val="28"/>
+          <w:szCs w:val="28"/>
+        </w:rPr>
+        <w:t xml:space="preserve">Теперь необходимо распаковать и установить тему напрямую в директорию </w:t>
+      </w:r>
+      <w:r>
+        <w:rPr>
+          <w:sz w:val="28"/>
+          <w:szCs w:val="28"/>
+          <w:lang w:val="en-US"/>
+        </w:rPr>
+        <w:t>Wordpress</w:t>
+      </w:r>
+      <w:r>
+        <w:rPr>
+          <w:sz w:val="28"/>
+          <w:szCs w:val="28"/>
+        </w:rPr>
+        <w:t xml:space="preserve">. </w:t>
+      </w:r>
+      <w:r>
+        <w:rPr>
+          <w:sz w:val="28"/>
+          <w:szCs w:val="28"/>
+        </w:rPr>
+        <w:t xml:space="preserve">Для этого сначала установим утилиту </w:t>
+      </w:r>
+      <w:r>
+        <w:rPr>
+          <w:sz w:val="28"/>
+          <w:szCs w:val="28"/>
+          <w:lang w:val="en-US"/>
+        </w:rPr>
+        <w:t>unzip</w:t>
+      </w:r>
+      <w:r>
+        <w:rPr>
+          <w:sz w:val="28"/>
+          <w:szCs w:val="28"/>
+        </w:rPr>
+        <w:t>. Результат установки представлен на рисунке 3.8.</w:t>
+      </w:r>
+    </w:p>
+    <w:p>
+      <w:pPr>
+        <w:spacing w:before="240" w:after="120"/>
+        <w:jc w:val="center"/>
+        <w:rPr>
+          <w:sz w:val="28"/>
+          <w:szCs w:val="28"/>
+        </w:rPr>
+      </w:pPr>
+      <w:r>
+        <w:rPr>
+          <w:sz w:val="28"/>
+          <w:szCs w:val="28"/>
+        </w:rPr>
+        <w:drawing>
+          <wp:inline distT="0" distB="0" distL="0" distR="0" wp14:anchorId="1076E510" wp14:editId="40B1CCD5">
+            <wp:extent cx="6372225" cy="2465070"/>
+            <wp:effectExtent l="0" t="0" r="9525" b="0"/>
+            <wp:docPr id="22" name="Рисунок 22"/>
+            <wp:cNvGraphicFramePr>
+              <a:graphicFrameLocks xmlns:a="http://schemas.openxmlformats.org/drawingml/2006/main" noChangeAspect="1"/>
+            </wp:cNvGraphicFramePr>
+            <a:graphic xmlns:a="http://schemas.openxmlformats.org/drawingml/2006/main">
+              <a:graphicData uri="http://schemas.openxmlformats.org/drawingml/2006/picture">
+                <pic:pic xmlns:pic="http://schemas.openxmlformats.org/drawingml/2006/picture">
+                  <pic:nvPicPr>
+                    <pic:cNvPr id="1" name=""/>
+                    <pic:cNvPicPr/>
+                  </pic:nvPicPr>
+                  <pic:blipFill>
+                    <a:blip r:embed="rId27"/>
+                    <a:stretch>
+                      <a:fillRect/>
+                    </a:stretch>
+                  </pic:blipFill>
+                  <pic:spPr>
+                    <a:xfrm>
+                      <a:off x="0" y="0"/>
+                      <a:ext cx="6372225" cy="2465070"/>
+                    </a:xfrm>
+                    <a:prstGeom prst="rect">
+                      <a:avLst/>
+                    </a:prstGeom>
+                  </pic:spPr>
+                </pic:pic>
+              </a:graphicData>
+            </a:graphic>
+          </wp:inline>
+        </w:drawing>
+      </w:r>
+    </w:p>
+    <w:p>
+      <w:pPr>
+        <w:jc w:val="center"/>
+        <w:rPr>
+          <w:sz w:val="28"/>
+          <w:szCs w:val="28"/>
+        </w:rPr>
+      </w:pPr>
+      <w:r>
+        <w:rPr>
+          <w:sz w:val="28"/>
+          <w:szCs w:val="28"/>
+        </w:rPr>
+        <w:t>Рисунок 3.8 – Результат установки у</w:t>
+      </w:r>
+      <w:r>
+        <w:rPr>
+          <w:sz w:val="28"/>
+          <w:szCs w:val="28"/>
+        </w:rPr>
+        <w:t>т</w:t>
+      </w:r>
+      <w:r>
+        <w:rPr>
+          <w:sz w:val="28"/>
+          <w:szCs w:val="28"/>
+        </w:rPr>
+        <w:t xml:space="preserve">илиты </w:t>
+      </w:r>
+      <w:r>
+        <w:rPr>
+          <w:sz w:val="28"/>
+          <w:szCs w:val="28"/>
+          <w:lang w:val="en-US"/>
+        </w:rPr>
+        <w:t>unzip</w:t>
+      </w:r>
+    </w:p>
+    <w:p>
+      <w:pPr>
+        <w:spacing w:before="240"/>
+        <w:ind w:firstLine="708"/>
+        <w:jc w:val="both"/>
+        <w:rPr>
+          <w:sz w:val="28"/>
+          <w:szCs w:val="28"/>
+        </w:rPr>
+      </w:pPr>
+      <w:r>
+        <w:rPr>
+          <w:sz w:val="28"/>
+          <w:szCs w:val="28"/>
+        </w:rPr>
+        <w:t xml:space="preserve">И наконец распакуем архив </w:t>
+      </w:r>
+      <w:r>
+        <w:rPr>
+          <w:sz w:val="28"/>
+          <w:szCs w:val="28"/>
+        </w:rPr>
+        <w:t xml:space="preserve">в директорию, в которой находится </w:t>
+      </w:r>
+      <w:r>
+        <w:rPr>
+          <w:sz w:val="28"/>
+          <w:szCs w:val="28"/>
+          <w:lang w:val="en-US"/>
+        </w:rPr>
+        <w:t>Wordpress</w:t>
+      </w:r>
+      <w:r>
+        <w:rPr>
+          <w:sz w:val="28"/>
+          <w:szCs w:val="28"/>
+        </w:rPr>
+        <w:t xml:space="preserve"> </w:t>
+      </w:r>
+      <w:r>
+        <w:rPr>
+          <w:sz w:val="28"/>
+          <w:szCs w:val="28"/>
+        </w:rPr>
+        <w:t>с помощью ранее установленной утилиты, выдадим на него соответствующие права</w:t>
+      </w:r>
+      <w:r>
+        <w:rPr>
+          <w:sz w:val="28"/>
+          <w:szCs w:val="28"/>
+        </w:rPr>
+        <w:t xml:space="preserve">. </w:t>
+      </w:r>
+      <w:r>
+        <w:rPr>
+          <w:sz w:val="28"/>
+          <w:szCs w:val="28"/>
+        </w:rPr>
+        <w:t>После чего проверим корректность выполненных действий</w:t>
+      </w:r>
+      <w:r>
+        <w:rPr>
+          <w:sz w:val="28"/>
+          <w:szCs w:val="28"/>
+        </w:rPr>
+        <w:t xml:space="preserve"> (рисунок 3.9).</w:t>
+      </w:r>
+    </w:p>
+    <w:p>
+      <w:pPr>
+        <w:spacing w:before="240" w:after="120"/>
+        <w:jc w:val="center"/>
+        <w:rPr>
+          <w:sz w:val="28"/>
+          <w:szCs w:val="28"/>
+        </w:rPr>
+      </w:pPr>
+      <w:r>
+        <w:rPr>
+          <w:sz w:val="28"/>
+          <w:szCs w:val="28"/>
+        </w:rPr>
+        <w:drawing>
+          <wp:inline distT="0" distB="0" distL="0" distR="0" wp14:anchorId="1472AEFF" wp14:editId="3E143735">
+            <wp:extent cx="6372225" cy="2678430"/>
+            <wp:effectExtent l="0" t="0" r="9525" b="7620"/>
+            <wp:docPr id="23" name="Рисунок 23"/>
+            <wp:cNvGraphicFramePr>
+              <a:graphicFrameLocks xmlns:a="http://schemas.openxmlformats.org/drawingml/2006/main" noChangeAspect="1"/>
+            </wp:cNvGraphicFramePr>
+            <a:graphic xmlns:a="http://schemas.openxmlformats.org/drawingml/2006/main">
+              <a:graphicData uri="http://schemas.openxmlformats.org/drawingml/2006/picture">
+                <pic:pic xmlns:pic="http://schemas.openxmlformats.org/drawingml/2006/picture">
+                  <pic:nvPicPr>
+                    <pic:cNvPr id="1" name=""/>
+                    <pic:cNvPicPr/>
+                  </pic:nvPicPr>
+                  <pic:blipFill>
+                    <a:blip r:embed="rId28"/>
+                    <a:stretch>
+                      <a:fillRect/>
+                    </a:stretch>
+                  </pic:blipFill>
+                  <pic:spPr>
+                    <a:xfrm>
+                      <a:off x="0" y="0"/>
+                      <a:ext cx="6372225" cy="2678430"/>
+                    </a:xfrm>
+                    <a:prstGeom prst="rect">
+                      <a:avLst/>
+                    </a:prstGeom>
+                  </pic:spPr>
+                </pic:pic>
+              </a:graphicData>
+            </a:graphic>
+          </wp:inline>
+        </w:drawing>
+      </w:r>
+    </w:p>
+    <w:p>
+      <w:pPr>
+        <w:jc w:val="center"/>
+        <w:rPr>
+          <w:sz w:val="28"/>
+          <w:szCs w:val="28"/>
+          <w:lang w:val="en-US"/>
+        </w:rPr>
+      </w:pPr>
+      <w:r>
+        <w:rPr>
+          <w:sz w:val="28"/>
+          <w:szCs w:val="28"/>
+        </w:rPr>
+        <w:t xml:space="preserve">Рисунок 3.9 – Доступность темы в браузерном клиенте </w:t>
+      </w:r>
+      <w:r>
+        <w:rPr>
+          <w:sz w:val="28"/>
+          <w:szCs w:val="28"/>
+          <w:lang w:val="en-US"/>
+        </w:rPr>
+        <w:t>Wordpress</w:t>
+      </w:r>
+    </w:p>
+    <w:p>
+      <w:pPr>
+        <w:spacing w:before="240"/>
+        <w:ind w:firstLine="708"/>
+        <w:rPr>
+          <w:sz w:val="28"/>
+          <w:szCs w:val="28"/>
+        </w:rPr>
+      </w:pPr>
+      <w:r>
+        <w:rPr>
+          <w:sz w:val="28"/>
+          <w:szCs w:val="28"/>
+        </w:rPr>
+        <w:t xml:space="preserve">После этого применим тему и проверим, с помощью браузерного клиента </w:t>
+      </w:r>
+      <w:r>
+        <w:rPr>
+          <w:sz w:val="28"/>
+          <w:szCs w:val="28"/>
+          <w:lang w:val="en-US"/>
+        </w:rPr>
+        <w:t>Wordpress</w:t>
+      </w:r>
+      <w:r>
+        <w:rPr>
+          <w:sz w:val="28"/>
+          <w:szCs w:val="28"/>
+        </w:rPr>
+        <w:t xml:space="preserve">, </w:t>
+      </w:r>
+      <w:r>
+        <w:rPr>
+          <w:sz w:val="28"/>
+          <w:szCs w:val="28"/>
+        </w:rPr>
+        <w:t>применились ли изменения и изменилась ли тема. Результат представлен на рисунке 3.10.</w:t>
+      </w:r>
+    </w:p>
+    <w:p>
+      <w:pPr>
+        <w:jc w:val="center"/>
+        <w:rPr>
+          <w:sz w:val="28"/>
+          <w:szCs w:val="28"/>
+        </w:rPr>
+      </w:pPr>
+      <w:r>
+        <w:rPr>
+          <w:sz w:val="28"/>
+          <w:szCs w:val="28"/>
+        </w:rPr>
+        <w:lastRenderedPageBreak/>
+        <w:drawing>
+          <wp:inline distT="0" distB="0" distL="0" distR="0" wp14:anchorId="610E0540" wp14:editId="6968BD9C">
+            <wp:extent cx="4351020" cy="4521852"/>
+            <wp:effectExtent l="0" t="0" r="0" b="0"/>
+            <wp:docPr id="26" name="Рисунок 26"/>
+            <wp:cNvGraphicFramePr>
+              <a:graphicFrameLocks xmlns:a="http://schemas.openxmlformats.org/drawingml/2006/main" noChangeAspect="1"/>
+            </wp:cNvGraphicFramePr>
+            <a:graphic xmlns:a="http://schemas.openxmlformats.org/drawingml/2006/main">
+              <a:graphicData uri="http://schemas.openxmlformats.org/drawingml/2006/picture">
+                <pic:pic xmlns:pic="http://schemas.openxmlformats.org/drawingml/2006/picture">
+                  <pic:nvPicPr>
+                    <pic:cNvPr id="1" name=""/>
+                    <pic:cNvPicPr/>
+                  </pic:nvPicPr>
+                  <pic:blipFill>
+                    <a:blip r:embed="rId29"/>
+                    <a:stretch>
+                      <a:fillRect/>
+                    </a:stretch>
+                  </pic:blipFill>
+                  <pic:spPr>
+                    <a:xfrm>
+                      <a:off x="0" y="0"/>
+                      <a:ext cx="4357530" cy="4528618"/>
+                    </a:xfrm>
+                    <a:prstGeom prst="rect">
+                      <a:avLst/>
+                    </a:prstGeom>
+                  </pic:spPr>
+                </pic:pic>
+              </a:graphicData>
+            </a:graphic>
+          </wp:inline>
+        </w:drawing>
+      </w:r>
+    </w:p>
+    <w:p>
+      <w:pPr>
+        <w:jc w:val="center"/>
+        <w:rPr>
+          <w:sz w:val="28"/>
+          <w:szCs w:val="28"/>
+        </w:rPr>
+      </w:pPr>
+      <w:r>
+        <w:rPr>
+          <w:sz w:val="28"/>
+          <w:szCs w:val="28"/>
+        </w:rPr>
+        <w:t>Рисунок 3.10 – Результат применения ранее установленной темы</w:t>
+      </w:r>
+    </w:p>
+    <w:p>
+      <w:pPr>
+        <w:spacing w:before="240"/>
+        <w:ind w:firstLine="708"/>
+        <w:jc w:val="both"/>
+        <w:rPr>
+          <w:sz w:val="28"/>
+          <w:szCs w:val="28"/>
+        </w:rPr>
+      </w:pPr>
+      <w:r>
+        <w:rPr>
+          <w:sz w:val="28"/>
+          <w:szCs w:val="28"/>
+        </w:rPr>
+        <w:t xml:space="preserve">Далее по ходу лабораторной работы необходимо установить плагин </w:t>
+      </w:r>
+      <w:proofErr w:type="spellStart"/>
+      <w:r>
+        <w:rPr>
+          <w:sz w:val="28"/>
+          <w:szCs w:val="28"/>
+          <w:lang w:val="en-US"/>
+        </w:rPr>
+        <w:t>Cyrlitera</w:t>
+      </w:r>
+      <w:proofErr w:type="spellEnd"/>
+      <w:r>
+        <w:rPr>
+          <w:sz w:val="28"/>
+          <w:szCs w:val="28"/>
+        </w:rPr>
+        <w:t xml:space="preserve"> </w:t>
+      </w:r>
+      <w:r>
+        <w:rPr>
+          <w:sz w:val="28"/>
+          <w:szCs w:val="28"/>
+        </w:rPr>
+        <w:t xml:space="preserve">для </w:t>
+      </w:r>
+      <w:r>
+        <w:rPr>
+          <w:sz w:val="28"/>
+          <w:szCs w:val="28"/>
+          <w:lang w:val="en-US"/>
+        </w:rPr>
+        <w:t>Wordpress</w:t>
+      </w:r>
+      <w:r>
+        <w:rPr>
+          <w:sz w:val="28"/>
+          <w:szCs w:val="28"/>
+        </w:rPr>
+        <w:t xml:space="preserve">. </w:t>
+      </w:r>
+      <w:r>
+        <w:rPr>
+          <w:sz w:val="28"/>
+          <w:szCs w:val="28"/>
+        </w:rPr>
+        <w:t>Процесс установки и переброски архива на виртуальную машину идентичен установке темы, поэтому выполним ту же последовательность действий и проверим наличие архива в папке пользователя (рисунок 3.11).</w:t>
+      </w:r>
+    </w:p>
+    <w:p>
+      <w:pPr>
+        <w:spacing w:before="240" w:after="120"/>
+        <w:jc w:val="center"/>
+        <w:rPr>
+          <w:sz w:val="28"/>
+          <w:szCs w:val="28"/>
+        </w:rPr>
+      </w:pPr>
+      <w:r>
+        <w:rPr>
+          <w:sz w:val="28"/>
+          <w:szCs w:val="28"/>
+        </w:rPr>
+        <w:drawing>
+          <wp:inline distT="0" distB="0" distL="0" distR="0" wp14:anchorId="2B09CBF6" wp14:editId="31E25816">
+            <wp:extent cx="5410955" cy="628738"/>
+            <wp:effectExtent l="0" t="0" r="0" b="0"/>
+            <wp:docPr id="27" name="Рисунок 27"/>
+            <wp:cNvGraphicFramePr>
+              <a:graphicFrameLocks xmlns:a="http://schemas.openxmlformats.org/drawingml/2006/main" noChangeAspect="1"/>
+            </wp:cNvGraphicFramePr>
+            <a:graphic xmlns:a="http://schemas.openxmlformats.org/drawingml/2006/main">
+              <a:graphicData uri="http://schemas.openxmlformats.org/drawingml/2006/picture">
+                <pic:pic xmlns:pic="http://schemas.openxmlformats.org/drawingml/2006/picture">
+                  <pic:nvPicPr>
+                    <pic:cNvPr id="1" name=""/>
+                    <pic:cNvPicPr/>
+                  </pic:nvPicPr>
+                  <pic:blipFill>
+                    <a:blip r:embed="rId30"/>
+                    <a:stretch>
+                      <a:fillRect/>
+                    </a:stretch>
+                  </pic:blipFill>
+                  <pic:spPr>
+                    <a:xfrm>
+                      <a:off x="0" y="0"/>
+                      <a:ext cx="5410955" cy="628738"/>
+                    </a:xfrm>
+                    <a:prstGeom prst="rect">
+                      <a:avLst/>
+                    </a:prstGeom>
+                  </pic:spPr>
+                </pic:pic>
+              </a:graphicData>
+            </a:graphic>
+          </wp:inline>
+        </w:drawing>
+      </w:r>
+    </w:p>
+    <w:p>
+      <w:pPr>
+        <w:jc w:val="center"/>
+        <w:rPr>
+          <w:sz w:val="28"/>
+          <w:szCs w:val="28"/>
+        </w:rPr>
+      </w:pPr>
+      <w:r>
+        <w:rPr>
+          <w:sz w:val="28"/>
+          <w:szCs w:val="28"/>
+        </w:rPr>
+        <w:t xml:space="preserve">Рисунок 3.11 – Результат переброски архива с плагином по </w:t>
+      </w:r>
+      <w:r>
+        <w:rPr>
+          <w:sz w:val="28"/>
+          <w:szCs w:val="28"/>
+          <w:lang w:val="en-US"/>
+        </w:rPr>
+        <w:t>FTP</w:t>
+      </w:r>
+      <w:r>
+        <w:rPr>
+          <w:sz w:val="28"/>
+          <w:szCs w:val="28"/>
+        </w:rPr>
+        <w:t>-</w:t>
+      </w:r>
+      <w:r>
+        <w:rPr>
+          <w:sz w:val="28"/>
+          <w:szCs w:val="28"/>
+        </w:rPr>
+        <w:t>соединению</w:t>
+      </w:r>
+    </w:p>
+    <w:p>
+      <w:pPr>
+        <w:spacing w:before="240"/>
+        <w:ind w:firstLine="708"/>
+        <w:jc w:val="both"/>
+        <w:rPr>
+          <w:sz w:val="28"/>
+          <w:szCs w:val="28"/>
+        </w:rPr>
+      </w:pPr>
+      <w:r>
+        <w:rPr>
+          <w:sz w:val="28"/>
+          <w:szCs w:val="28"/>
+        </w:rPr>
+        <w:t xml:space="preserve">После этого распакуем установленный архив с помощью утилиты </w:t>
+      </w:r>
+      <w:r>
+        <w:rPr>
+          <w:sz w:val="28"/>
+          <w:szCs w:val="28"/>
+          <w:lang w:val="en-US"/>
+        </w:rPr>
+        <w:t>unzip</w:t>
+      </w:r>
+      <w:r>
+        <w:rPr>
+          <w:sz w:val="28"/>
+          <w:szCs w:val="28"/>
+        </w:rPr>
+        <w:t xml:space="preserve"> </w:t>
+      </w:r>
+      <w:r>
+        <w:rPr>
+          <w:sz w:val="28"/>
+          <w:szCs w:val="28"/>
+        </w:rPr>
+        <w:t xml:space="preserve">в директорию для хранения плагинов </w:t>
+      </w:r>
+      <w:r>
+        <w:rPr>
+          <w:sz w:val="28"/>
+          <w:szCs w:val="28"/>
+          <w:lang w:val="en-US"/>
+        </w:rPr>
+        <w:t>Wordpress</w:t>
+      </w:r>
+      <w:r>
+        <w:rPr>
+          <w:sz w:val="28"/>
+          <w:szCs w:val="28"/>
+        </w:rPr>
+        <w:t xml:space="preserve"> </w:t>
+      </w:r>
+      <w:r>
+        <w:rPr>
+          <w:sz w:val="28"/>
+          <w:szCs w:val="28"/>
+        </w:rPr>
+        <w:t xml:space="preserve">и применим этот плагин через браузерный клиент </w:t>
+      </w:r>
+      <w:r>
+        <w:rPr>
+          <w:sz w:val="28"/>
+          <w:szCs w:val="28"/>
+          <w:lang w:val="en-US"/>
+        </w:rPr>
+        <w:t>Wordpress</w:t>
+      </w:r>
+      <w:r>
+        <w:rPr>
+          <w:sz w:val="28"/>
+          <w:szCs w:val="28"/>
+        </w:rPr>
+        <w:t>. Результат представлен на рисунке 3.12.</w:t>
+      </w:r>
+    </w:p>
+    <w:p>
+      <w:pPr>
+        <w:spacing w:before="240" w:after="120"/>
+        <w:jc w:val="center"/>
+        <w:rPr>
+          <w:sz w:val="28"/>
+          <w:szCs w:val="28"/>
+        </w:rPr>
+      </w:pPr>
+      <w:r>
+        <w:rPr>
+          <w:sz w:val="28"/>
+          <w:szCs w:val="28"/>
+        </w:rPr>
+        <w:drawing>
+          <wp:inline distT="0" distB="0" distL="0" distR="0" wp14:anchorId="6B62AF8F" wp14:editId="37B4DCF4">
+            <wp:extent cx="4229100" cy="1408014"/>
+            <wp:effectExtent l="0" t="0" r="0" b="1905"/>
+            <wp:docPr id="28" name="Рисунок 28"/>
+            <wp:cNvGraphicFramePr>
+              <a:graphicFrameLocks xmlns:a="http://schemas.openxmlformats.org/drawingml/2006/main" noChangeAspect="1"/>
+            </wp:cNvGraphicFramePr>
+            <a:graphic xmlns:a="http://schemas.openxmlformats.org/drawingml/2006/main">
+              <a:graphicData uri="http://schemas.openxmlformats.org/drawingml/2006/picture">
+                <pic:pic xmlns:pic="http://schemas.openxmlformats.org/drawingml/2006/picture">
+                  <pic:nvPicPr>
+                    <pic:cNvPr id="1" name=""/>
+                    <pic:cNvPicPr/>
+                  </pic:nvPicPr>
+                  <pic:blipFill>
+                    <a:blip r:embed="rId31"/>
+                    <a:stretch>
+                      <a:fillRect/>
+                    </a:stretch>
+                  </pic:blipFill>
+                  <pic:spPr>
+                    <a:xfrm>
+                      <a:off x="0" y="0"/>
+                      <a:ext cx="4237884" cy="1410938"/>
+                    </a:xfrm>
+                    <a:prstGeom prst="rect">
+                      <a:avLst/>
+                    </a:prstGeom>
+                  </pic:spPr>
+                </pic:pic>
+              </a:graphicData>
+            </a:graphic>
+          </wp:inline>
+        </w:drawing>
+      </w:r>
+    </w:p>
+    <w:p>
+      <w:pPr>
+        <w:jc w:val="center"/>
+        <w:rPr>
+          <w:sz w:val="28"/>
+          <w:szCs w:val="28"/>
+        </w:rPr>
+      </w:pPr>
+      <w:r>
+        <w:rPr>
+          <w:sz w:val="28"/>
+          <w:szCs w:val="28"/>
+        </w:rPr>
+        <w:t>Рисунок 3.12 – Результат активации установленного плагина</w:t>
+      </w:r>
+    </w:p>
+    <w:p>
+      <w:pPr>
+        <w:ind w:firstLine="708"/>
+        <w:jc w:val="both"/>
+        <w:rPr>
+          <w:sz w:val="28"/>
+          <w:szCs w:val="28"/>
+        </w:rPr>
+      </w:pPr>
+      <w:r>
+        <w:rPr>
+          <w:sz w:val="28"/>
+          <w:szCs w:val="28"/>
+        </w:rPr>
+        <w:lastRenderedPageBreak/>
+        <w:t xml:space="preserve">После чего в качестве логического завершения большого блока работы с </w:t>
+      </w:r>
+      <w:r>
+        <w:rPr>
+          <w:sz w:val="28"/>
+          <w:szCs w:val="28"/>
+          <w:lang w:val="en-US"/>
+        </w:rPr>
+        <w:t>Wordpress</w:t>
+      </w:r>
+      <w:r>
+        <w:rPr>
+          <w:sz w:val="28"/>
+          <w:szCs w:val="28"/>
+        </w:rPr>
+        <w:t xml:space="preserve"> </w:t>
+      </w:r>
+      <w:r>
+        <w:rPr>
+          <w:sz w:val="28"/>
+          <w:szCs w:val="28"/>
+        </w:rPr>
+        <w:t xml:space="preserve">и сайтом </w:t>
+      </w:r>
+      <w:r>
+        <w:rPr>
+          <w:sz w:val="28"/>
+          <w:szCs w:val="28"/>
+          <w:lang w:val="en-US"/>
+        </w:rPr>
+        <w:t>site</w:t>
+      </w:r>
+      <w:r>
+        <w:rPr>
+          <w:sz w:val="28"/>
+          <w:szCs w:val="28"/>
+        </w:rPr>
+        <w:t>.</w:t>
+      </w:r>
+      <w:proofErr w:type="spellStart"/>
+      <w:r>
+        <w:rPr>
+          <w:sz w:val="28"/>
+          <w:szCs w:val="28"/>
+          <w:lang w:val="en-US"/>
+        </w:rPr>
+        <w:t>Filipiuk</w:t>
+      </w:r>
+      <w:proofErr w:type="spellEnd"/>
+      <w:r>
+        <w:rPr>
+          <w:sz w:val="28"/>
+          <w:szCs w:val="28"/>
+        </w:rPr>
+        <w:t>.</w:t>
+      </w:r>
+      <w:r>
+        <w:rPr>
+          <w:sz w:val="28"/>
+          <w:szCs w:val="28"/>
+          <w:lang w:val="en-US"/>
+        </w:rPr>
+        <w:t>by</w:t>
+      </w:r>
+      <w:r>
+        <w:rPr>
+          <w:sz w:val="28"/>
+          <w:szCs w:val="28"/>
+        </w:rPr>
+        <w:t xml:space="preserve"> </w:t>
+      </w:r>
+      <w:r>
+        <w:rPr>
+          <w:sz w:val="28"/>
+          <w:szCs w:val="28"/>
+        </w:rPr>
+        <w:t>необходимо создать не менее пяти иллюстративных записей. Результат представлен на рисунке 3.13.</w:t>
+      </w:r>
+    </w:p>
+    <w:p>
+      <w:pPr>
+        <w:spacing w:before="240" w:after="120"/>
+        <w:jc w:val="center"/>
+        <w:rPr>
+          <w:sz w:val="28"/>
+          <w:szCs w:val="28"/>
+        </w:rPr>
+      </w:pPr>
+      <w:r>
+        <w:rPr>
+          <w:sz w:val="28"/>
+          <w:szCs w:val="28"/>
+        </w:rPr>
+        <w:drawing>
+          <wp:inline distT="0" distB="0" distL="0" distR="0" wp14:anchorId="59E160DA" wp14:editId="7B405B8E">
+            <wp:extent cx="6372225" cy="3578225"/>
+            <wp:effectExtent l="0" t="0" r="9525" b="3175"/>
+            <wp:docPr id="29" name="Рисунок 29"/>
+            <wp:cNvGraphicFramePr>
+              <a:graphicFrameLocks xmlns:a="http://schemas.openxmlformats.org/drawingml/2006/main" noChangeAspect="1"/>
+            </wp:cNvGraphicFramePr>
+            <a:graphic xmlns:a="http://schemas.openxmlformats.org/drawingml/2006/main">
+              <a:graphicData uri="http://schemas.openxmlformats.org/drawingml/2006/picture">
+                <pic:pic xmlns:pic="http://schemas.openxmlformats.org/drawingml/2006/picture">
+                  <pic:nvPicPr>
+                    <pic:cNvPr id="1" name=""/>
+                    <pic:cNvPicPr/>
+                  </pic:nvPicPr>
+                  <pic:blipFill>
+                    <a:blip r:embed="rId32"/>
+                    <a:stretch>
+                      <a:fillRect/>
+                    </a:stretch>
+                  </pic:blipFill>
+                  <pic:spPr>
+                    <a:xfrm>
+                      <a:off x="0" y="0"/>
+                      <a:ext cx="6372225" cy="3578225"/>
+                    </a:xfrm>
+                    <a:prstGeom prst="rect">
+                      <a:avLst/>
+                    </a:prstGeom>
+                  </pic:spPr>
+                </pic:pic>
+              </a:graphicData>
+            </a:graphic>
+          </wp:inline>
+        </w:drawing>
+      </w:r>
+    </w:p>
+    <w:p>
+      <w:pPr>
+        <w:jc w:val="center"/>
+        <w:rPr>
+          <w:sz w:val="28"/>
+          <w:szCs w:val="28"/>
+        </w:rPr>
+      </w:pPr>
+      <w:r>
+        <w:rPr>
+          <w:sz w:val="28"/>
+          <w:szCs w:val="28"/>
+        </w:rPr>
+        <w:t>Рисунок 3.13 – Результат создания иллюстративных записей</w:t>
+      </w:r>
+    </w:p>
+    <w:p>
+      <w:pPr>
+        <w:spacing w:before="240"/>
+        <w:ind w:firstLine="708"/>
+        <w:jc w:val="both"/>
+        <w:rPr>
+          <w:sz w:val="28"/>
+          <w:szCs w:val="28"/>
+        </w:rPr>
+      </w:pPr>
+      <w:r>
+        <w:rPr>
+          <w:sz w:val="28"/>
+          <w:szCs w:val="28"/>
+        </w:rPr>
+        <w:t xml:space="preserve">Далее, начиная второй большой блок работы с </w:t>
+      </w:r>
+      <w:r>
+        <w:rPr>
+          <w:sz w:val="28"/>
+          <w:szCs w:val="28"/>
+          <w:lang w:val="en-US"/>
+        </w:rPr>
+        <w:t>Wordpress</w:t>
+      </w:r>
+      <w:r>
+        <w:rPr>
+          <w:sz w:val="28"/>
+          <w:szCs w:val="28"/>
+        </w:rPr>
+        <w:t xml:space="preserve">, </w:t>
+      </w:r>
+      <w:r>
+        <w:rPr>
+          <w:sz w:val="28"/>
+          <w:szCs w:val="28"/>
+        </w:rPr>
+        <w:t xml:space="preserve">необходимо скачать на физическую машину форумный движок </w:t>
+      </w:r>
+      <w:r>
+        <w:rPr>
+          <w:sz w:val="28"/>
+          <w:szCs w:val="28"/>
+          <w:lang w:val="en-US"/>
+        </w:rPr>
+        <w:t>PHPBB</w:t>
+      </w:r>
+      <w:r>
+        <w:rPr>
+          <w:sz w:val="28"/>
+          <w:szCs w:val="28"/>
+        </w:rPr>
+        <w:t xml:space="preserve">, передать по </w:t>
+      </w:r>
+      <w:r>
+        <w:rPr>
+          <w:sz w:val="28"/>
+          <w:szCs w:val="28"/>
+          <w:lang w:val="en-US"/>
+        </w:rPr>
+        <w:t>FTP</w:t>
+      </w:r>
+      <w:r>
+        <w:rPr>
+          <w:sz w:val="28"/>
+          <w:szCs w:val="28"/>
+        </w:rPr>
+        <w:t xml:space="preserve"> и распаковать на виртуальной машине. Результат передачи файла представлен на рисунке 3.14</w:t>
+      </w:r>
+    </w:p>
+    <w:p>
+      <w:pPr>
+        <w:spacing w:before="240" w:after="120"/>
+        <w:jc w:val="center"/>
+        <w:rPr>
+          <w:sz w:val="28"/>
+          <w:szCs w:val="28"/>
+        </w:rPr>
+      </w:pPr>
+      <w:r>
+        <w:rPr>
+          <w:sz w:val="28"/>
+          <w:szCs w:val="28"/>
+        </w:rPr>
+        <w:drawing>
+          <wp:inline distT="0" distB="0" distL="0" distR="0" wp14:anchorId="30A7F7BC" wp14:editId="43474910">
+            <wp:extent cx="6372225" cy="883920"/>
+            <wp:effectExtent l="0" t="0" r="9525" b="0"/>
+            <wp:docPr id="30" name="Рисунок 30"/>
+            <wp:cNvGraphicFramePr>
+              <a:graphicFrameLocks xmlns:a="http://schemas.openxmlformats.org/drawingml/2006/main" noChangeAspect="1"/>
+            </wp:cNvGraphicFramePr>
+            <a:graphic xmlns:a="http://schemas.openxmlformats.org/drawingml/2006/main">
+              <a:graphicData uri="http://schemas.openxmlformats.org/drawingml/2006/picture">
+                <pic:pic xmlns:pic="http://schemas.openxmlformats.org/drawingml/2006/picture">
+                  <pic:nvPicPr>
+                    <pic:cNvPr id="1" name=""/>
+                    <pic:cNvPicPr/>
+                  </pic:nvPicPr>
+                  <pic:blipFill>
+                    <a:blip r:embed="rId33"/>
+                    <a:stretch>
+                      <a:fillRect/>
+                    </a:stretch>
+                  </pic:blipFill>
+                  <pic:spPr>
+                    <a:xfrm>
+                      <a:off x="0" y="0"/>
+                      <a:ext cx="6372225" cy="883920"/>
+                    </a:xfrm>
+                    <a:prstGeom prst="rect">
+                      <a:avLst/>
+                    </a:prstGeom>
+                  </pic:spPr>
+                </pic:pic>
+              </a:graphicData>
+            </a:graphic>
+          </wp:inline>
+        </w:drawing>
+      </w:r>
+    </w:p>
+    <w:p>
+      <w:pPr>
+        <w:jc w:val="center"/>
+        <w:rPr>
+          <w:sz w:val="28"/>
+          <w:szCs w:val="28"/>
+          <w:lang w:val="en-US"/>
+        </w:rPr>
+      </w:pPr>
+      <w:r>
+        <w:rPr>
+          <w:sz w:val="28"/>
+          <w:szCs w:val="28"/>
+        </w:rPr>
+        <w:t xml:space="preserve">Рисунок 3.14 – Результат передачи архива с движком по </w:t>
+      </w:r>
+      <w:r>
+        <w:rPr>
+          <w:sz w:val="28"/>
+          <w:szCs w:val="28"/>
+          <w:lang w:val="en-US"/>
+        </w:rPr>
+        <w:t>FTP</w:t>
+      </w:r>
+    </w:p>
+    <w:p>
+      <w:pPr>
+        <w:spacing w:before="240"/>
+        <w:ind w:firstLine="708"/>
+        <w:jc w:val="both"/>
+        <w:rPr>
+          <w:sz w:val="28"/>
+          <w:szCs w:val="28"/>
+        </w:rPr>
+      </w:pPr>
+      <w:r>
+        <w:rPr>
+          <w:sz w:val="28"/>
+          <w:szCs w:val="28"/>
+        </w:rPr>
+        <w:t xml:space="preserve">Теперь создадим для форума отдельную директорию и с помощью утилиты </w:t>
+      </w:r>
+      <w:r>
+        <w:rPr>
+          <w:sz w:val="28"/>
+          <w:szCs w:val="28"/>
+          <w:lang w:val="en-US"/>
+        </w:rPr>
+        <w:t>unzip</w:t>
+      </w:r>
+      <w:r>
+        <w:rPr>
+          <w:sz w:val="28"/>
+          <w:szCs w:val="28"/>
+        </w:rPr>
+        <w:t xml:space="preserve"> </w:t>
+      </w:r>
+      <w:r>
+        <w:rPr>
+          <w:sz w:val="28"/>
+          <w:szCs w:val="28"/>
+        </w:rPr>
+        <w:t>распакуем в неё архив с движком. Результат данной операции представлен на рисунке 3.15.</w:t>
+      </w:r>
+    </w:p>
+    <w:p>
+      <w:pPr>
+        <w:spacing w:before="240" w:after="120"/>
+        <w:jc w:val="center"/>
+        <w:rPr>
+          <w:sz w:val="28"/>
+          <w:szCs w:val="28"/>
+        </w:rPr>
+      </w:pPr>
+      <w:r>
+        <w:rPr>
+          <w:sz w:val="28"/>
+          <w:szCs w:val="28"/>
+        </w:rPr>
+        <w:drawing>
+          <wp:inline distT="0" distB="0" distL="0" distR="0" wp14:anchorId="4C555464" wp14:editId="6DC08B4E">
+            <wp:extent cx="6372225" cy="1130935"/>
+            <wp:effectExtent l="0" t="0" r="9525" b="0"/>
+            <wp:docPr id="32" name="Рисунок 32"/>
+            <wp:cNvGraphicFramePr>
+              <a:graphicFrameLocks xmlns:a="http://schemas.openxmlformats.org/drawingml/2006/main" noChangeAspect="1"/>
+            </wp:cNvGraphicFramePr>
+            <a:graphic xmlns:a="http://schemas.openxmlformats.org/drawingml/2006/main">
+              <a:graphicData uri="http://schemas.openxmlformats.org/drawingml/2006/picture">
+                <pic:pic xmlns:pic="http://schemas.openxmlformats.org/drawingml/2006/picture">
+                  <pic:nvPicPr>
+                    <pic:cNvPr id="1" name=""/>
+                    <pic:cNvPicPr/>
+                  </pic:nvPicPr>
+                  <pic:blipFill>
+                    <a:blip r:embed="rId34"/>
+                    <a:stretch>
+                      <a:fillRect/>
+                    </a:stretch>
+                  </pic:blipFill>
+                  <pic:spPr>
+                    <a:xfrm>
+                      <a:off x="0" y="0"/>
+                      <a:ext cx="6372225" cy="1130935"/>
+                    </a:xfrm>
+                    <a:prstGeom prst="rect">
+                      <a:avLst/>
+                    </a:prstGeom>
+                  </pic:spPr>
+                </pic:pic>
+              </a:graphicData>
+            </a:graphic>
+          </wp:inline>
+        </w:drawing>
+      </w:r>
+    </w:p>
+    <w:p>
+      <w:pPr>
+        <w:jc w:val="center"/>
+        <w:rPr>
+          <w:sz w:val="28"/>
+          <w:szCs w:val="28"/>
+        </w:rPr>
+      </w:pPr>
+      <w:r>
+        <w:rPr>
+          <w:sz w:val="28"/>
+          <w:szCs w:val="28"/>
+        </w:rPr>
+        <w:t>Рисунок 3.15 – Результат распаковки архива с форумным движком</w:t>
+      </w:r>
+    </w:p>
+    <w:p>
+      <w:pPr>
         <w:jc w:val="both"/>
         <w:rPr>
           <w:sz w:val="28"/>
@@ -2681,6 +5640,93 @@
 <file path=word/numbering.xml><?xml version="1.0" encoding="utf-8"?>
 <w:numbering xmlns:wpc="http://schemas.microsoft.com/office/word/2010/wordprocessingCanvas" xmlns:cx="http://schemas.microsoft.com/office/drawing/2014/chartex" xmlns:cx1="http://schemas.microsoft.com/office/drawing/2015/9/8/chartex" xmlns:cx2="http://schemas.microsoft.com/office/drawing/2015/10/21/chartex" xmlns:cx3="http://schemas.microsoft.com/office/drawing/2016/5/9/chartex" xmlns:cx4="http://schemas.microsoft.com/office/drawing/2016/5/10/chartex" xmlns:cx5="http://schemas.microsoft.com/office/drawing/2016/5/11/chartex" xmlns:cx6="http://schemas.microsoft.com/office/drawing/2016/5/12/chartex" xmlns:cx7="http://schemas.microsoft.com/office/drawing/2016/5/13/chartex" xmlns:cx8="http://schemas.microsoft.com/office/drawing/2016/5/14/chartex" xmlns:mc="http://schemas.openxmlformats.org/markup-compatibility/2006" xmlns:aink="http://schemas.microsoft.com/office/drawing/2016/ink" xmlns:am3d="http://schemas.microsoft.com/office/drawing/2017/model3d" xmlns:o="urn:schemas-microsoft-com:office:office" xmlns:r="http://schemas.openxmlformats.org/officeDocument/2006/relationships" xmlns:m="http://schemas.openxmlformats.org/officeDocument/2006/math" xmlns:v="urn:schemas-microsoft-com:vml" xmlns:wp14="http://schemas.microsoft.com/office/word/2010/wordprocessingDrawing" xmlns:wp="http://schemas.openxmlformats.org/drawingml/2006/wordprocessingDrawing" xmlns:w10="urn:schemas-microsoft-com:office:word" xmlns:w="http://schemas.openxmlformats.org/wordprocessingml/2006/main" xmlns:w14="http://schemas.microsoft.com/office/word/2010/wordml" xmlns:w15="http://schemas.microsoft.com/office/word/2012/wordml" xmlns:w16cex="http://schemas.microsoft.com/office/word/2018/wordml/cex" xmlns:w16cid="http://schemas.microsoft.com/office/word/2016/wordml/cid" xmlns:w16="http://schemas.microsoft.com/office/word/2018/wordml" xmlns:w16sdtdh="http://schemas.microsoft.com/office/word/2020/wordml/sdtdatahash" xmlns:w16se="http://schemas.microsoft.com/office/word/2015/wordml/symex" xmlns:wpg="http://schemas.microsoft.com/office/word/2010/wordprocessingGroup" xmlns:wpi="http://schemas.microsoft.com/office/word/2010/wordprocessingInk" xmlns:wne="http://schemas.microsoft.com/office/word/2006/wordml" xmlns:wps="http://schemas.microsoft.com/office/word/2010/wordprocessingShape" mc:Ignorable="w14 w15 w16se w16cid w16 w16cex w16sdtdh wp14">
   <w:abstractNum w:abstractNumId="0" w15:restartNumberingAfterBreak="0">
+    <w:nsid w:val="1A4A4B84"/>
+    <w:multiLevelType w:val="hybridMultilevel"/>
+    <w:tmpl w:val="B85E7FF6"/>
+    <w:lvl w:ilvl="0" w:tplc="0508666A">
+      <w:start w:val="1"/>
+      <w:numFmt w:val="decimal"/>
+      <w:suff w:val="space"/>
+      <w:lvlText w:val="%1"/>
+      <w:lvlJc w:val="left"/>
+      <w:pPr>
+        <w:ind w:left="1069" w:hanging="360"/>
+      </w:pPr>
+    </w:lvl>
+    <w:lvl w:ilvl="1" w:tplc="20000019">
+      <w:start w:val="1"/>
+      <w:numFmt w:val="lowerLetter"/>
+      <w:lvlText w:val="%2."/>
+      <w:lvlJc w:val="left"/>
+      <w:pPr>
+        <w:ind w:left="1789" w:hanging="360"/>
+      </w:pPr>
+    </w:lvl>
+    <w:lvl w:ilvl="2" w:tplc="2000001B">
+      <w:start w:val="1"/>
+      <w:numFmt w:val="lowerRoman"/>
+      <w:lvlText w:val="%3."/>
+      <w:lvlJc w:val="right"/>
+      <w:pPr>
+        <w:ind w:left="2509" w:hanging="180"/>
+      </w:pPr>
+    </w:lvl>
+    <w:lvl w:ilvl="3" w:tplc="2000000F">
+      <w:start w:val="1"/>
+      <w:numFmt w:val="decimal"/>
+      <w:lvlText w:val="%4."/>
+      <w:lvlJc w:val="left"/>
+      <w:pPr>
+        <w:ind w:left="3229" w:hanging="360"/>
+      </w:pPr>
+    </w:lvl>
+    <w:lvl w:ilvl="4" w:tplc="20000019">
+      <w:start w:val="1"/>
+      <w:numFmt w:val="lowerLetter"/>
+      <w:lvlText w:val="%5."/>
+      <w:lvlJc w:val="left"/>
+      <w:pPr>
+        <w:ind w:left="3949" w:hanging="360"/>
+      </w:pPr>
+    </w:lvl>
+    <w:lvl w:ilvl="5" w:tplc="2000001B">
+      <w:start w:val="1"/>
+      <w:numFmt w:val="lowerRoman"/>
+      <w:lvlText w:val="%6."/>
+      <w:lvlJc w:val="right"/>
+      <w:pPr>
+        <w:ind w:left="4669" w:hanging="180"/>
+      </w:pPr>
+    </w:lvl>
+    <w:lvl w:ilvl="6" w:tplc="2000000F">
+      <w:start w:val="1"/>
+      <w:numFmt w:val="decimal"/>
+      <w:lvlText w:val="%7."/>
+      <w:lvlJc w:val="left"/>
+      <w:pPr>
+        <w:ind w:left="5389" w:hanging="360"/>
+      </w:pPr>
+    </w:lvl>
+    <w:lvl w:ilvl="7" w:tplc="20000019">
+      <w:start w:val="1"/>
+      <w:numFmt w:val="lowerLetter"/>
+      <w:lvlText w:val="%8."/>
+      <w:lvlJc w:val="left"/>
+      <w:pPr>
+        <w:ind w:left="6109" w:hanging="360"/>
+      </w:pPr>
+    </w:lvl>
+    <w:lvl w:ilvl="8" w:tplc="2000001B">
+      <w:start w:val="1"/>
+      <w:numFmt w:val="lowerRoman"/>
+      <w:lvlText w:val="%9."/>
+      <w:lvlJc w:val="right"/>
+      <w:pPr>
+        <w:ind w:left="6829" w:hanging="180"/>
+      </w:pPr>
+    </w:lvl>
+  </w:abstractNum>
+  <w:abstractNum w:abstractNumId="1" w15:restartNumberingAfterBreak="0">
     <w:nsid w:val="28AF02E3"/>
     <w:multiLevelType w:val="hybridMultilevel"/>
     <w:tmpl w:val="B85E7FF6"/>
@@ -2767,7 +5813,7 @@
       </w:pPr>
     </w:lvl>
   </w:abstractNum>
-  <w:abstractNum w:abstractNumId="1" w15:restartNumberingAfterBreak="0">
+  <w:abstractNum w:abstractNumId="2" w15:restartNumberingAfterBreak="0">
     <w:nsid w:val="31BB140B"/>
     <w:multiLevelType w:val="hybridMultilevel"/>
     <w:tmpl w:val="B85E7FF6"/>
@@ -2855,7 +5901,7 @@
     </w:lvl>
   </w:abstractNum>
   <w:num w:numId="1">
-    <w:abstractNumId w:val="1"/>
+    <w:abstractNumId w:val="2"/>
     <w:lvlOverride w:ilvl="0">
       <w:startOverride w:val="1"/>
     </w:lvlOverride>
@@ -2885,9 +5931,12 @@
     </w:lvlOverride>
   </w:num>
   <w:num w:numId="2">
+    <w:abstractNumId w:val="2"/>
+  </w:num>
+  <w:num w:numId="3">
     <w:abstractNumId w:val="1"/>
   </w:num>
-  <w:num w:numId="3">
+  <w:num w:numId="4">
     <w:abstractNumId w:val="0"/>
   </w:num>
 </w:numbering>
@@ -3382,6 +6431,29 @@
       </w:tblBorders>
     </w:tblPr>
   </w:style>
+  <w:style w:type="character" w:styleId="a4">
+    <w:name w:val="Hyperlink"/>
+    <w:basedOn w:val="a0"/>
+    <w:uiPriority w:val="99"/>
+    <w:unhideWhenUsed/>
+    <w:rsid w:val="0009180C"/>
+    <w:rPr>
+      <w:color w:val="0563C1" w:themeColor="hyperlink"/>
+      <w:u w:val="single"/>
+    </w:rPr>
+  </w:style>
+  <w:style w:type="character" w:styleId="a5">
+    <w:name w:val="Unresolved Mention"/>
+    <w:basedOn w:val="a0"/>
+    <w:uiPriority w:val="99"/>
+    <w:semiHidden/>
+    <w:unhideWhenUsed/>
+    <w:rsid w:val="0009180C"/>
+    <w:rPr>
+      <w:color w:val="605E5C"/>
+      <w:shd w:val="clear" w:color="auto" w:fill="E1DFDD"/>
+    </w:rPr>
+  </w:style>
 </w:styles>
 </file>
 

</xml_diff>

<commit_message>
ISAS:lab2 in progress. Owncloud installation in progress
</commit_message>
<xml_diff>
--- a/ISAS/Reports/Report_2.docx
+++ b/ISAS/Reports/Report_2.docx
@@ -2308,6 +2308,7 @@
               <w:rPr>
                 <w:sz w:val="28"/>
                 <w:szCs w:val="28"/>
+                <w:lang w:val="en-US"/>
               </w:rPr>
             </w:pPr>
             <w:r>
@@ -2612,6 +2613,7 @@
       </w:pPr>
       <w:r>
         <w:rPr>
+          <w:noProof/>
           <w:sz w:val="28"/>
           <w:szCs w:val="28"/>
         </w:rPr>
@@ -2744,6 +2746,7 @@
       </w:pPr>
       <w:r>
         <w:rPr>
+          <w:noProof/>
           <w:sz w:val="28"/>
           <w:szCs w:val="28"/>
         </w:rPr>
@@ -2791,7 +2794,6 @@
         <w:rPr>
           <w:sz w:val="28"/>
           <w:szCs w:val="28"/>
-          <w:lang w:val="en-US"/>
         </w:rPr>
       </w:pPr>
       <w:r>
@@ -2920,6 +2922,7 @@
       </w:pPr>
       <w:r>
         <w:rPr>
+          <w:noProof/>
           <w:sz w:val="28"/>
           <w:szCs w:val="28"/>
         </w:rPr>
@@ -2966,7 +2969,6 @@
         <w:rPr>
           <w:sz w:val="28"/>
           <w:szCs w:val="28"/>
-          <w:lang w:val="en-US"/>
         </w:rPr>
       </w:pPr>
       <w:r>
@@ -3060,6 +3062,7 @@
       </w:pPr>
       <w:r>
         <w:rPr>
+          <w:noProof/>
           <w:sz w:val="28"/>
           <w:szCs w:val="28"/>
           <w:lang w:val="en-US"/>
@@ -3107,7 +3110,6 @@
         <w:rPr>
           <w:sz w:val="28"/>
           <w:szCs w:val="28"/>
-          <w:lang w:val="en-US"/>
         </w:rPr>
       </w:pPr>
       <w:r>
@@ -3271,6 +3273,7 @@
       </w:pPr>
       <w:r>
         <w:rPr>
+          <w:noProof/>
           <w:sz w:val="28"/>
           <w:szCs w:val="28"/>
         </w:rPr>
@@ -3318,7 +3321,6 @@
         <w:rPr>
           <w:sz w:val="28"/>
           <w:szCs w:val="28"/>
-          <w:lang w:val="en-US"/>
         </w:rPr>
       </w:pPr>
       <w:r>
@@ -3441,6 +3443,7 @@
       </w:pPr>
       <w:r>
         <w:rPr>
+          <w:noProof/>
           <w:sz w:val="28"/>
           <w:szCs w:val="28"/>
         </w:rPr>
@@ -3487,7 +3490,6 @@
         <w:rPr>
           <w:sz w:val="28"/>
           <w:szCs w:val="28"/>
-          <w:lang w:val="en-US"/>
         </w:rPr>
       </w:pPr>
       <w:r>
@@ -3642,6 +3644,7 @@
       </w:pPr>
       <w:r>
         <w:rPr>
+          <w:noProof/>
           <w:sz w:val="28"/>
           <w:szCs w:val="28"/>
         </w:rPr>
@@ -3749,6 +3752,7 @@
       </w:pPr>
       <w:r>
         <w:rPr>
+          <w:noProof/>
           <w:sz w:val="28"/>
           <w:szCs w:val="28"/>
         </w:rPr>
@@ -3795,7 +3799,6 @@
         <w:rPr>
           <w:sz w:val="28"/>
           <w:szCs w:val="28"/>
-          <w:lang w:val="en-US"/>
         </w:rPr>
       </w:pPr>
       <w:r>
@@ -3990,6 +3993,7 @@
       </w:pPr>
       <w:r>
         <w:rPr>
+          <w:noProof/>
           <w:sz w:val="28"/>
           <w:szCs w:val="28"/>
         </w:rPr>
@@ -4175,6 +4179,7 @@
       </w:pPr>
       <w:r>
         <w:rPr>
+          <w:noProof/>
           <w:sz w:val="28"/>
           <w:szCs w:val="28"/>
         </w:rPr>
@@ -4442,6 +4447,7 @@
       </w:pPr>
       <w:r>
         <w:rPr>
+          <w:noProof/>
           <w:sz w:val="28"/>
           <w:szCs w:val="28"/>
         </w:rPr>
@@ -4579,6 +4585,7 @@
       </w:pPr>
       <w:r>
         <w:rPr>
+          <w:noProof/>
           <w:sz w:val="28"/>
           <w:szCs w:val="28"/>
         </w:rPr>
@@ -4736,6 +4743,7 @@
       </w:pPr>
       <w:r>
         <w:rPr>
+          <w:noProof/>
           <w:sz w:val="28"/>
           <w:szCs w:val="28"/>
         </w:rPr>
@@ -4782,7 +4790,6 @@
         <w:rPr>
           <w:sz w:val="28"/>
           <w:szCs w:val="28"/>
-          <w:lang w:val="en-US"/>
         </w:rPr>
       </w:pPr>
       <w:r>
@@ -4850,6 +4857,7 @@
       </w:pPr>
       <w:r>
         <w:rPr>
+          <w:noProof/>
           <w:sz w:val="28"/>
           <w:szCs w:val="28"/>
         </w:rPr>
@@ -4982,6 +4990,7 @@
       </w:pPr>
       <w:r>
         <w:rPr>
+          <w:noProof/>
           <w:sz w:val="28"/>
           <w:szCs w:val="28"/>
         </w:rPr>
@@ -5148,6 +5157,7 @@
       </w:pPr>
       <w:r>
         <w:rPr>
+          <w:noProof/>
           <w:sz w:val="28"/>
           <w:szCs w:val="28"/>
         </w:rPr>
@@ -5309,6 +5319,7 @@
       </w:pPr>
       <w:r>
         <w:rPr>
+          <w:noProof/>
           <w:sz w:val="28"/>
           <w:szCs w:val="28"/>
         </w:rPr>
@@ -5446,6 +5457,7 @@
       </w:pPr>
       <w:r>
         <w:rPr>
+          <w:noProof/>
           <w:sz w:val="28"/>
           <w:szCs w:val="28"/>
         </w:rPr>
@@ -5492,7 +5504,6 @@
         <w:rPr>
           <w:sz w:val="28"/>
           <w:szCs w:val="28"/>
-          <w:lang w:val="en-US"/>
         </w:rPr>
       </w:pPr>
       <w:r>
@@ -5562,6 +5573,7 @@
       </w:pPr>
       <w:r>
         <w:rPr>
+          <w:noProof/>
           <w:sz w:val="28"/>
           <w:szCs w:val="28"/>
         </w:rPr>
@@ -5616,6 +5628,1272 @@
           <w:szCs w:val="28"/>
         </w:rPr>
         <w:t>Рисунок 3.15 – Результат распаковки архива с форумным движком</w:t>
+      </w:r>
+    </w:p>
+    <w:p>
+      <w:pPr>
+        <w:ind w:firstLine="708"/>
+        <w:jc w:val="both"/>
+        <w:rPr>
+          <w:sz w:val="28"/>
+          <w:szCs w:val="28"/>
+        </w:rPr>
+      </w:pPr>
+      <w:r>
+        <w:rPr>
+          <w:sz w:val="28"/>
+          <w:szCs w:val="28"/>
+        </w:rPr>
+        <w:lastRenderedPageBreak/>
+        <w:t xml:space="preserve">После этого скачаем компоненты </w:t>
+      </w:r>
+      <w:r>
+        <w:rPr>
+          <w:sz w:val="28"/>
+          <w:szCs w:val="28"/>
+          <w:lang w:val="en-US"/>
+        </w:rPr>
+        <w:t>PHPBB</w:t>
+      </w:r>
+      <w:r>
+        <w:rPr>
+          <w:sz w:val="28"/>
+          <w:szCs w:val="28"/>
+        </w:rPr>
+        <w:t xml:space="preserve"> </w:t>
+      </w:r>
+      <w:r>
+        <w:rPr>
+          <w:sz w:val="28"/>
+          <w:szCs w:val="28"/>
+        </w:rPr>
+        <w:t xml:space="preserve">для русского языка и передадим их по </w:t>
+      </w:r>
+      <w:r>
+        <w:rPr>
+          <w:sz w:val="28"/>
+          <w:szCs w:val="28"/>
+          <w:lang w:val="en-US"/>
+        </w:rPr>
+        <w:t>FTP</w:t>
+      </w:r>
+      <w:r>
+        <w:rPr>
+          <w:sz w:val="28"/>
+          <w:szCs w:val="28"/>
+        </w:rPr>
+        <w:t xml:space="preserve"> </w:t>
+      </w:r>
+      <w:r>
+        <w:rPr>
+          <w:sz w:val="28"/>
+          <w:szCs w:val="28"/>
+        </w:rPr>
+        <w:t>на виртуальную машину. Результат данного действия представлен на рисунке 3.16.</w:t>
+      </w:r>
+    </w:p>
+    <w:p>
+      <w:pPr>
+        <w:spacing w:before="240" w:after="120"/>
+        <w:jc w:val="center"/>
+        <w:rPr>
+          <w:sz w:val="28"/>
+          <w:szCs w:val="28"/>
+        </w:rPr>
+      </w:pPr>
+      <w:r>
+        <w:rPr>
+          <w:sz w:val="28"/>
+          <w:szCs w:val="28"/>
+        </w:rPr>
+        <w:drawing>
+          <wp:inline distT="0" distB="0" distL="0" distR="0" wp14:anchorId="4D7D6A06" wp14:editId="5E6DC20C">
+            <wp:extent cx="6372225" cy="746125"/>
+            <wp:effectExtent l="0" t="0" r="9525" b="0"/>
+            <wp:docPr id="10" name="Рисунок 10"/>
+            <wp:cNvGraphicFramePr>
+              <a:graphicFrameLocks xmlns:a="http://schemas.openxmlformats.org/drawingml/2006/main" noChangeAspect="1"/>
+            </wp:cNvGraphicFramePr>
+            <a:graphic xmlns:a="http://schemas.openxmlformats.org/drawingml/2006/main">
+              <a:graphicData uri="http://schemas.openxmlformats.org/drawingml/2006/picture">
+                <pic:pic xmlns:pic="http://schemas.openxmlformats.org/drawingml/2006/picture">
+                  <pic:nvPicPr>
+                    <pic:cNvPr id="1" name=""/>
+                    <pic:cNvPicPr/>
+                  </pic:nvPicPr>
+                  <pic:blipFill>
+                    <a:blip r:embed="rId35"/>
+                    <a:stretch>
+                      <a:fillRect/>
+                    </a:stretch>
+                  </pic:blipFill>
+                  <pic:spPr>
+                    <a:xfrm>
+                      <a:off x="0" y="0"/>
+                      <a:ext cx="6372225" cy="746125"/>
+                    </a:xfrm>
+                    <a:prstGeom prst="rect">
+                      <a:avLst/>
+                    </a:prstGeom>
+                  </pic:spPr>
+                </pic:pic>
+              </a:graphicData>
+            </a:graphic>
+          </wp:inline>
+        </w:drawing>
+      </w:r>
+    </w:p>
+    <w:p>
+      <w:pPr>
+        <w:jc w:val="center"/>
+        <w:rPr>
+          <w:sz w:val="28"/>
+          <w:szCs w:val="28"/>
+          <w:lang w:val="en-US"/>
+        </w:rPr>
+      </w:pPr>
+      <w:r>
+        <w:rPr>
+          <w:sz w:val="28"/>
+          <w:szCs w:val="28"/>
+        </w:rPr>
+        <w:t xml:space="preserve">Рисунок 3.16 – Результат передачи компонентов для русского языка по </w:t>
+      </w:r>
+      <w:r>
+        <w:rPr>
+          <w:sz w:val="28"/>
+          <w:szCs w:val="28"/>
+          <w:lang w:val="en-US"/>
+        </w:rPr>
+        <w:t>FTP</w:t>
+      </w:r>
+    </w:p>
+    <w:p>
+      <w:pPr>
+        <w:spacing w:before="240"/>
+        <w:ind w:firstLine="708"/>
+        <w:jc w:val="both"/>
+        <w:rPr>
+          <w:sz w:val="28"/>
+          <w:szCs w:val="28"/>
+        </w:rPr>
+      </w:pPr>
+      <w:r>
+        <w:rPr>
+          <w:sz w:val="28"/>
+          <w:szCs w:val="28"/>
+        </w:rPr>
+        <w:t xml:space="preserve">Далее распакуем </w:t>
+      </w:r>
+      <w:r>
+        <w:rPr>
+          <w:sz w:val="28"/>
+          <w:szCs w:val="28"/>
+        </w:rPr>
+        <w:t xml:space="preserve">ранее установленный архив в нужную папку форума с помощью утилиты </w:t>
+      </w:r>
+      <w:r>
+        <w:rPr>
+          <w:sz w:val="28"/>
+          <w:szCs w:val="28"/>
+          <w:lang w:val="en-US"/>
+        </w:rPr>
+        <w:t>unzip</w:t>
+      </w:r>
+      <w:r>
+        <w:rPr>
+          <w:sz w:val="28"/>
+          <w:szCs w:val="28"/>
+        </w:rPr>
+        <w:t xml:space="preserve">. </w:t>
+      </w:r>
+      <w:r>
+        <w:rPr>
+          <w:sz w:val="28"/>
+          <w:szCs w:val="28"/>
+        </w:rPr>
+        <w:t>Результат данного действия представлен на рисунке 3.17.</w:t>
+      </w:r>
+    </w:p>
+    <w:p>
+      <w:pPr>
+        <w:spacing w:before="240" w:after="120"/>
+        <w:jc w:val="center"/>
+        <w:rPr>
+          <w:sz w:val="28"/>
+          <w:szCs w:val="28"/>
+        </w:rPr>
+      </w:pPr>
+      <w:r>
+        <w:rPr>
+          <w:sz w:val="28"/>
+          <w:szCs w:val="28"/>
+        </w:rPr>
+        <w:drawing>
+          <wp:inline distT="0" distB="0" distL="0" distR="0" wp14:anchorId="4E86AD06" wp14:editId="1609D092">
+            <wp:extent cx="6372225" cy="1092835"/>
+            <wp:effectExtent l="0" t="0" r="9525" b="0"/>
+            <wp:docPr id="21" name="Рисунок 21"/>
+            <wp:cNvGraphicFramePr>
+              <a:graphicFrameLocks xmlns:a="http://schemas.openxmlformats.org/drawingml/2006/main" noChangeAspect="1"/>
+            </wp:cNvGraphicFramePr>
+            <a:graphic xmlns:a="http://schemas.openxmlformats.org/drawingml/2006/main">
+              <a:graphicData uri="http://schemas.openxmlformats.org/drawingml/2006/picture">
+                <pic:pic xmlns:pic="http://schemas.openxmlformats.org/drawingml/2006/picture">
+                  <pic:nvPicPr>
+                    <pic:cNvPr id="1" name=""/>
+                    <pic:cNvPicPr/>
+                  </pic:nvPicPr>
+                  <pic:blipFill>
+                    <a:blip r:embed="rId36"/>
+                    <a:stretch>
+                      <a:fillRect/>
+                    </a:stretch>
+                  </pic:blipFill>
+                  <pic:spPr>
+                    <a:xfrm>
+                      <a:off x="0" y="0"/>
+                      <a:ext cx="6372225" cy="1092835"/>
+                    </a:xfrm>
+                    <a:prstGeom prst="rect">
+                      <a:avLst/>
+                    </a:prstGeom>
+                  </pic:spPr>
+                </pic:pic>
+              </a:graphicData>
+            </a:graphic>
+          </wp:inline>
+        </w:drawing>
+      </w:r>
+    </w:p>
+    <w:p>
+      <w:pPr>
+        <w:jc w:val="center"/>
+        <w:rPr>
+          <w:sz w:val="28"/>
+          <w:szCs w:val="28"/>
+        </w:rPr>
+      </w:pPr>
+      <w:r>
+        <w:rPr>
+          <w:sz w:val="28"/>
+          <w:szCs w:val="28"/>
+        </w:rPr>
+        <w:t>Рисунок 3.17 – Результат распаковки архива</w:t>
+      </w:r>
+    </w:p>
+    <w:p>
+      <w:pPr>
+        <w:spacing w:before="240"/>
+        <w:ind w:firstLine="708"/>
+        <w:jc w:val="both"/>
+        <w:rPr>
+          <w:sz w:val="28"/>
+          <w:szCs w:val="28"/>
+          <w:lang w:val="be-BY"/>
+        </w:rPr>
+      </w:pPr>
+      <w:r>
+        <w:rPr>
+          <w:sz w:val="28"/>
+          <w:szCs w:val="28"/>
+          <w:lang w:val="be-BY"/>
+        </w:rPr>
+        <w:t>После этого настроим конфигурационный файл для форума. Результат представлен на рисунке 3.18.</w:t>
+      </w:r>
+    </w:p>
+    <w:p>
+      <w:pPr>
+        <w:spacing w:before="240" w:after="120"/>
+        <w:jc w:val="center"/>
+        <w:rPr>
+          <w:sz w:val="28"/>
+          <w:szCs w:val="28"/>
+          <w:lang w:val="be-BY"/>
+        </w:rPr>
+      </w:pPr>
+      <w:r>
+        <w:rPr>
+          <w:sz w:val="28"/>
+          <w:szCs w:val="28"/>
+          <w:lang w:val="be-BY"/>
+        </w:rPr>
+        <w:drawing>
+          <wp:inline distT="0" distB="0" distL="0" distR="0" wp14:anchorId="28FE22A1" wp14:editId="38833409">
+            <wp:extent cx="5782482" cy="2419688"/>
+            <wp:effectExtent l="0" t="0" r="0" b="0"/>
+            <wp:docPr id="24" name="Рисунок 24"/>
+            <wp:cNvGraphicFramePr>
+              <a:graphicFrameLocks xmlns:a="http://schemas.openxmlformats.org/drawingml/2006/main" noChangeAspect="1"/>
+            </wp:cNvGraphicFramePr>
+            <a:graphic xmlns:a="http://schemas.openxmlformats.org/drawingml/2006/main">
+              <a:graphicData uri="http://schemas.openxmlformats.org/drawingml/2006/picture">
+                <pic:pic xmlns:pic="http://schemas.openxmlformats.org/drawingml/2006/picture">
+                  <pic:nvPicPr>
+                    <pic:cNvPr id="1" name=""/>
+                    <pic:cNvPicPr/>
+                  </pic:nvPicPr>
+                  <pic:blipFill>
+                    <a:blip r:embed="rId37"/>
+                    <a:stretch>
+                      <a:fillRect/>
+                    </a:stretch>
+                  </pic:blipFill>
+                  <pic:spPr>
+                    <a:xfrm>
+                      <a:off x="0" y="0"/>
+                      <a:ext cx="5782482" cy="2419688"/>
+                    </a:xfrm>
+                    <a:prstGeom prst="rect">
+                      <a:avLst/>
+                    </a:prstGeom>
+                  </pic:spPr>
+                </pic:pic>
+              </a:graphicData>
+            </a:graphic>
+          </wp:inline>
+        </w:drawing>
+      </w:r>
+    </w:p>
+    <w:p>
+      <w:pPr>
+        <w:jc w:val="center"/>
+        <w:rPr>
+          <w:sz w:val="28"/>
+          <w:szCs w:val="28"/>
+          <w:lang w:val="be-BY"/>
+        </w:rPr>
+      </w:pPr>
+      <w:r>
+        <w:rPr>
+          <w:sz w:val="28"/>
+          <w:szCs w:val="28"/>
+          <w:lang w:val="be-BY"/>
+        </w:rPr>
+        <w:t>Рисунок 3.18 – Конфигурационный файл для форума после изменения</w:t>
+      </w:r>
+    </w:p>
+    <w:p>
+      <w:pPr>
+        <w:spacing w:before="240"/>
+        <w:ind w:firstLine="708"/>
+        <w:jc w:val="both"/>
+        <w:rPr>
+          <w:sz w:val="28"/>
+          <w:szCs w:val="28"/>
+        </w:rPr>
+      </w:pPr>
+      <w:r>
+        <w:rPr>
+          <w:sz w:val="28"/>
+          <w:szCs w:val="28"/>
+          <w:lang w:val="be-BY"/>
+        </w:rPr>
+        <w:t xml:space="preserve">Теперь включим отконфигурированный сайт, перезапустим службу </w:t>
+      </w:r>
+      <w:proofErr w:type="spellStart"/>
+      <w:r>
+        <w:rPr>
+          <w:sz w:val="28"/>
+          <w:szCs w:val="28"/>
+          <w:lang w:val="en-US"/>
+        </w:rPr>
+        <w:t>apache</w:t>
+      </w:r>
+      <w:proofErr w:type="spellEnd"/>
+      <w:r>
+        <w:rPr>
+          <w:sz w:val="28"/>
+          <w:szCs w:val="28"/>
+        </w:rPr>
+        <w:t xml:space="preserve">2 </w:t>
+      </w:r>
+      <w:r>
+        <w:rPr>
+          <w:sz w:val="28"/>
+          <w:szCs w:val="28"/>
+        </w:rPr>
+        <w:t>и выдадим необходимые права доступа. Результат данных действий представлен на рисунке 3.19.</w:t>
+      </w:r>
+    </w:p>
+    <w:p>
+      <w:pPr>
+        <w:spacing w:after="120"/>
+        <w:jc w:val="center"/>
+        <w:rPr>
+          <w:sz w:val="28"/>
+          <w:szCs w:val="28"/>
+        </w:rPr>
+      </w:pPr>
+      <w:r>
+        <w:rPr>
+          <w:sz w:val="28"/>
+          <w:szCs w:val="28"/>
+        </w:rPr>
+        <w:lastRenderedPageBreak/>
+        <w:drawing>
+          <wp:inline distT="0" distB="0" distL="0" distR="0" wp14:anchorId="3EE2EC60" wp14:editId="461FB612">
+            <wp:extent cx="6372225" cy="1468755"/>
+            <wp:effectExtent l="0" t="0" r="9525" b="0"/>
+            <wp:docPr id="31" name="Рисунок 31"/>
+            <wp:cNvGraphicFramePr>
+              <a:graphicFrameLocks xmlns:a="http://schemas.openxmlformats.org/drawingml/2006/main" noChangeAspect="1"/>
+            </wp:cNvGraphicFramePr>
+            <a:graphic xmlns:a="http://schemas.openxmlformats.org/drawingml/2006/main">
+              <a:graphicData uri="http://schemas.openxmlformats.org/drawingml/2006/picture">
+                <pic:pic xmlns:pic="http://schemas.openxmlformats.org/drawingml/2006/picture">
+                  <pic:nvPicPr>
+                    <pic:cNvPr id="1" name=""/>
+                    <pic:cNvPicPr/>
+                  </pic:nvPicPr>
+                  <pic:blipFill>
+                    <a:blip r:embed="rId38"/>
+                    <a:stretch>
+                      <a:fillRect/>
+                    </a:stretch>
+                  </pic:blipFill>
+                  <pic:spPr>
+                    <a:xfrm>
+                      <a:off x="0" y="0"/>
+                      <a:ext cx="6372225" cy="1468755"/>
+                    </a:xfrm>
+                    <a:prstGeom prst="rect">
+                      <a:avLst/>
+                    </a:prstGeom>
+                  </pic:spPr>
+                </pic:pic>
+              </a:graphicData>
+            </a:graphic>
+          </wp:inline>
+        </w:drawing>
+      </w:r>
+    </w:p>
+    <w:p>
+      <w:pPr>
+        <w:jc w:val="center"/>
+        <w:rPr>
+          <w:sz w:val="28"/>
+          <w:szCs w:val="28"/>
+        </w:rPr>
+      </w:pPr>
+      <w:r>
+        <w:rPr>
+          <w:sz w:val="28"/>
+          <w:szCs w:val="28"/>
+        </w:rPr>
+        <w:t>Рисунок 3.19 – Результат запуска сайта после конфигурации</w:t>
+      </w:r>
+    </w:p>
+    <w:p>
+      <w:pPr>
+        <w:spacing w:before="240"/>
+        <w:ind w:firstLine="708"/>
+        <w:jc w:val="both"/>
+        <w:rPr>
+          <w:sz w:val="28"/>
+          <w:szCs w:val="28"/>
+        </w:rPr>
+      </w:pPr>
+      <w:r>
+        <w:rPr>
+          <w:sz w:val="28"/>
+          <w:szCs w:val="28"/>
+        </w:rPr>
+        <w:t xml:space="preserve">Теперь перейдём в браузер для запуска </w:t>
+      </w:r>
+      <w:proofErr w:type="spellStart"/>
+      <w:r>
+        <w:rPr>
+          <w:sz w:val="28"/>
+          <w:szCs w:val="28"/>
+        </w:rPr>
+        <w:t>инсталятора</w:t>
+      </w:r>
+      <w:proofErr w:type="spellEnd"/>
+      <w:r>
+        <w:rPr>
+          <w:sz w:val="28"/>
+          <w:szCs w:val="28"/>
+        </w:rPr>
+        <w:t xml:space="preserve"> и, после завершения его работы, проверим успешность установки, перейдя по </w:t>
+      </w:r>
+      <w:hyperlink r:id="rId39" w:history="1">
+        <w:r>
+          <w:rPr>
+            <w:rStyle w:val="a4"/>
+            <w:sz w:val="28"/>
+            <w:szCs w:val="28"/>
+            <w:lang w:val="en-US"/>
+          </w:rPr>
+          <w:t>http</w:t>
+        </w:r>
+        <w:r>
+          <w:rPr>
+            <w:rStyle w:val="a4"/>
+            <w:sz w:val="28"/>
+            <w:szCs w:val="28"/>
+          </w:rPr>
+          <w:t>://</w:t>
+        </w:r>
+        <w:r>
+          <w:rPr>
+            <w:rStyle w:val="a4"/>
+            <w:sz w:val="28"/>
+            <w:szCs w:val="28"/>
+            <w:lang w:val="en-US"/>
+          </w:rPr>
+          <w:t>forum</w:t>
+        </w:r>
+        <w:r>
+          <w:rPr>
+            <w:rStyle w:val="a4"/>
+            <w:sz w:val="28"/>
+            <w:szCs w:val="28"/>
+          </w:rPr>
+          <w:t>.</w:t>
+        </w:r>
+        <w:proofErr w:type="spellStart"/>
+        <w:r>
+          <w:rPr>
+            <w:rStyle w:val="a4"/>
+            <w:sz w:val="28"/>
+            <w:szCs w:val="28"/>
+            <w:lang w:val="en-US"/>
+          </w:rPr>
+          <w:t>filipiuk</w:t>
+        </w:r>
+        <w:proofErr w:type="spellEnd"/>
+        <w:r>
+          <w:rPr>
+            <w:rStyle w:val="a4"/>
+            <w:sz w:val="28"/>
+            <w:szCs w:val="28"/>
+          </w:rPr>
+          <w:t>.</w:t>
+        </w:r>
+        <w:r>
+          <w:rPr>
+            <w:rStyle w:val="a4"/>
+            <w:sz w:val="28"/>
+            <w:szCs w:val="28"/>
+            <w:lang w:val="en-US"/>
+          </w:rPr>
+          <w:t>by</w:t>
+        </w:r>
+      </w:hyperlink>
+      <w:r>
+        <w:rPr>
+          <w:sz w:val="28"/>
+          <w:szCs w:val="28"/>
+        </w:rPr>
+        <w:t xml:space="preserve">. </w:t>
+      </w:r>
+      <w:r>
+        <w:rPr>
+          <w:sz w:val="28"/>
+          <w:szCs w:val="28"/>
+        </w:rPr>
+        <w:t>Результат данных действий представлен на рисунке 3.20.</w:t>
+      </w:r>
+    </w:p>
+    <w:p>
+      <w:pPr>
+        <w:spacing w:before="240" w:after="120"/>
+        <w:jc w:val="center"/>
+        <w:rPr>
+          <w:sz w:val="28"/>
+          <w:szCs w:val="28"/>
+        </w:rPr>
+      </w:pPr>
+      <w:r>
+        <w:rPr>
+          <w:sz w:val="28"/>
+          <w:szCs w:val="28"/>
+        </w:rPr>
+        <w:drawing>
+          <wp:inline distT="0" distB="0" distL="0" distR="0" wp14:anchorId="4426C589" wp14:editId="6286CE15">
+            <wp:extent cx="6372225" cy="3633470"/>
+            <wp:effectExtent l="0" t="0" r="9525" b="5080"/>
+            <wp:docPr id="33" name="Рисунок 33"/>
+            <wp:cNvGraphicFramePr>
+              <a:graphicFrameLocks xmlns:a="http://schemas.openxmlformats.org/drawingml/2006/main" noChangeAspect="1"/>
+            </wp:cNvGraphicFramePr>
+            <a:graphic xmlns:a="http://schemas.openxmlformats.org/drawingml/2006/main">
+              <a:graphicData uri="http://schemas.openxmlformats.org/drawingml/2006/picture">
+                <pic:pic xmlns:pic="http://schemas.openxmlformats.org/drawingml/2006/picture">
+                  <pic:nvPicPr>
+                    <pic:cNvPr id="1" name=""/>
+                    <pic:cNvPicPr/>
+                  </pic:nvPicPr>
+                  <pic:blipFill>
+                    <a:blip r:embed="rId40"/>
+                    <a:stretch>
+                      <a:fillRect/>
+                    </a:stretch>
+                  </pic:blipFill>
+                  <pic:spPr>
+                    <a:xfrm>
+                      <a:off x="0" y="0"/>
+                      <a:ext cx="6372225" cy="3633470"/>
+                    </a:xfrm>
+                    <a:prstGeom prst="rect">
+                      <a:avLst/>
+                    </a:prstGeom>
+                  </pic:spPr>
+                </pic:pic>
+              </a:graphicData>
+            </a:graphic>
+          </wp:inline>
+        </w:drawing>
+      </w:r>
+    </w:p>
+    <w:p>
+      <w:pPr>
+        <w:jc w:val="center"/>
+        <w:rPr>
+          <w:sz w:val="28"/>
+          <w:szCs w:val="28"/>
+        </w:rPr>
+      </w:pPr>
+      <w:r>
+        <w:rPr>
+          <w:sz w:val="28"/>
+          <w:szCs w:val="28"/>
+        </w:rPr>
+        <w:t>Рисунок 3.20 – Результат установки формного движка</w:t>
+      </w:r>
+    </w:p>
+    <w:p>
+      <w:pPr>
+        <w:spacing w:before="240"/>
+        <w:ind w:firstLine="708"/>
+        <w:jc w:val="both"/>
+        <w:rPr>
+          <w:sz w:val="28"/>
+          <w:szCs w:val="28"/>
+        </w:rPr>
+      </w:pPr>
+      <w:r>
+        <w:rPr>
+          <w:sz w:val="28"/>
+          <w:szCs w:val="28"/>
+        </w:rPr>
+        <w:t>Теперь в браузере создадим форму с пятью разделами, один из которых сделаем доступным только для администраторов. Результат данных действий представлен на рисунке 3.21.</w:t>
+      </w:r>
+    </w:p>
+    <w:p>
+      <w:pPr>
+        <w:spacing w:before="240" w:after="120"/>
+        <w:jc w:val="center"/>
+        <w:rPr>
+          <w:sz w:val="28"/>
+          <w:szCs w:val="28"/>
+        </w:rPr>
+      </w:pPr>
+      <w:r>
+        <w:rPr>
+          <w:sz w:val="28"/>
+          <w:szCs w:val="28"/>
+        </w:rPr>
+        <w:drawing>
+          <wp:inline distT="0" distB="0" distL="0" distR="0" wp14:anchorId="4A25ACFB" wp14:editId="521CD9B9">
+            <wp:extent cx="6372225" cy="1203960"/>
+            <wp:effectExtent l="0" t="0" r="9525" b="0"/>
+            <wp:docPr id="34" name="Рисунок 34"/>
+            <wp:cNvGraphicFramePr>
+              <a:graphicFrameLocks xmlns:a="http://schemas.openxmlformats.org/drawingml/2006/main" noChangeAspect="1"/>
+            </wp:cNvGraphicFramePr>
+            <a:graphic xmlns:a="http://schemas.openxmlformats.org/drawingml/2006/main">
+              <a:graphicData uri="http://schemas.openxmlformats.org/drawingml/2006/picture">
+                <pic:pic xmlns:pic="http://schemas.openxmlformats.org/drawingml/2006/picture">
+                  <pic:nvPicPr>
+                    <pic:cNvPr id="1" name=""/>
+                    <pic:cNvPicPr/>
+                  </pic:nvPicPr>
+                  <pic:blipFill>
+                    <a:blip r:embed="rId41"/>
+                    <a:stretch>
+                      <a:fillRect/>
+                    </a:stretch>
+                  </pic:blipFill>
+                  <pic:spPr>
+                    <a:xfrm>
+                      <a:off x="0" y="0"/>
+                      <a:ext cx="6372225" cy="1203960"/>
+                    </a:xfrm>
+                    <a:prstGeom prst="rect">
+                      <a:avLst/>
+                    </a:prstGeom>
+                  </pic:spPr>
+                </pic:pic>
+              </a:graphicData>
+            </a:graphic>
+          </wp:inline>
+        </w:drawing>
+      </w:r>
+    </w:p>
+    <w:p>
+      <w:pPr>
+        <w:jc w:val="center"/>
+        <w:rPr>
+          <w:sz w:val="28"/>
+          <w:szCs w:val="28"/>
+        </w:rPr>
+      </w:pPr>
+      <w:r>
+        <w:rPr>
+          <w:sz w:val="28"/>
+          <w:szCs w:val="28"/>
+        </w:rPr>
+        <w:t>Рисунок 3.21 – Результат создания форумов</w:t>
+      </w:r>
+    </w:p>
+    <w:p>
+      <w:pPr>
+        <w:spacing w:before="240"/>
+        <w:ind w:firstLine="708"/>
+        <w:jc w:val="both"/>
+        <w:rPr>
+          <w:sz w:val="28"/>
+          <w:szCs w:val="28"/>
+        </w:rPr>
+      </w:pPr>
+      <w:r>
+        <w:rPr>
+          <w:sz w:val="28"/>
+          <w:szCs w:val="28"/>
+        </w:rPr>
+        <w:lastRenderedPageBreak/>
+        <w:t xml:space="preserve">После чего необходимо </w:t>
+      </w:r>
+      <w:r>
+        <w:rPr>
+          <w:sz w:val="28"/>
+          <w:szCs w:val="28"/>
+        </w:rPr>
+        <w:t>зарегистрировать двух пользователей с выдуманными почтовыми адресами, активировать их через администраторский раздел пользователем-основателем, одного из пользователей добавить в группу администраторов</w:t>
+      </w:r>
+      <w:r>
+        <w:rPr>
+          <w:sz w:val="28"/>
+          <w:szCs w:val="28"/>
+        </w:rPr>
+        <w:t>. Результат данных действий представлен на рисунке 3.22.</w:t>
+      </w:r>
+    </w:p>
+    <w:p>
+      <w:pPr>
+        <w:spacing w:before="240" w:after="120"/>
+        <w:jc w:val="center"/>
+        <w:rPr>
+          <w:sz w:val="28"/>
+          <w:szCs w:val="28"/>
+        </w:rPr>
+      </w:pPr>
+      <w:r>
+        <w:rPr>
+          <w:sz w:val="28"/>
+          <w:szCs w:val="28"/>
+        </w:rPr>
+        <w:drawing>
+          <wp:inline distT="0" distB="0" distL="0" distR="0" wp14:anchorId="7E739233" wp14:editId="2232F9CD">
+            <wp:extent cx="6372225" cy="945515"/>
+            <wp:effectExtent l="0" t="0" r="9525" b="6985"/>
+            <wp:docPr id="35" name="Рисунок 35"/>
+            <wp:cNvGraphicFramePr>
+              <a:graphicFrameLocks xmlns:a="http://schemas.openxmlformats.org/drawingml/2006/main" noChangeAspect="1"/>
+            </wp:cNvGraphicFramePr>
+            <a:graphic xmlns:a="http://schemas.openxmlformats.org/drawingml/2006/main">
+              <a:graphicData uri="http://schemas.openxmlformats.org/drawingml/2006/picture">
+                <pic:pic xmlns:pic="http://schemas.openxmlformats.org/drawingml/2006/picture">
+                  <pic:nvPicPr>
+                    <pic:cNvPr id="1" name=""/>
+                    <pic:cNvPicPr/>
+                  </pic:nvPicPr>
+                  <pic:blipFill>
+                    <a:blip r:embed="rId42"/>
+                    <a:stretch>
+                      <a:fillRect/>
+                    </a:stretch>
+                  </pic:blipFill>
+                  <pic:spPr>
+                    <a:xfrm>
+                      <a:off x="0" y="0"/>
+                      <a:ext cx="6372225" cy="945515"/>
+                    </a:xfrm>
+                    <a:prstGeom prst="rect">
+                      <a:avLst/>
+                    </a:prstGeom>
+                  </pic:spPr>
+                </pic:pic>
+              </a:graphicData>
+            </a:graphic>
+          </wp:inline>
+        </w:drawing>
+      </w:r>
+    </w:p>
+    <w:p>
+      <w:pPr>
+        <w:jc w:val="center"/>
+        <w:rPr>
+          <w:sz w:val="28"/>
+          <w:szCs w:val="28"/>
+          <w:lang w:val="be-BY"/>
+        </w:rPr>
+      </w:pPr>
+      <w:r>
+        <w:rPr>
+          <w:sz w:val="28"/>
+          <w:szCs w:val="28"/>
+          <w:lang w:val="be-BY"/>
+        </w:rPr>
+        <w:t>Рисунок 3.22 – Результат добавления новых пользователей</w:t>
+      </w:r>
+    </w:p>
+    <w:p>
+      <w:pPr>
+        <w:spacing w:before="240"/>
+        <w:ind w:firstLine="708"/>
+        <w:jc w:val="both"/>
+        <w:rPr>
+          <w:sz w:val="28"/>
+          <w:szCs w:val="28"/>
+        </w:rPr>
+      </w:pPr>
+      <w:r>
+        <w:rPr>
+          <w:sz w:val="28"/>
+          <w:szCs w:val="28"/>
+        </w:rPr>
+        <w:t xml:space="preserve">Теперь необходимо скачать на физическую машину и передать по </w:t>
+      </w:r>
+      <w:r>
+        <w:rPr>
+          <w:sz w:val="28"/>
+          <w:szCs w:val="28"/>
+          <w:lang w:val="en-US"/>
+        </w:rPr>
+        <w:t>FTP</w:t>
+      </w:r>
+      <w:r>
+        <w:rPr>
+          <w:sz w:val="28"/>
+          <w:szCs w:val="28"/>
+        </w:rPr>
+        <w:t xml:space="preserve"> на виртуальную машину движок облачного хранилища </w:t>
+      </w:r>
+      <w:proofErr w:type="spellStart"/>
+      <w:r>
+        <w:rPr>
+          <w:sz w:val="28"/>
+          <w:szCs w:val="28"/>
+          <w:lang w:val="en-US"/>
+        </w:rPr>
+        <w:t>Owncloud</w:t>
+      </w:r>
+      <w:proofErr w:type="spellEnd"/>
+      <w:r>
+        <w:rPr>
+          <w:sz w:val="28"/>
+          <w:szCs w:val="28"/>
+        </w:rPr>
+        <w:t xml:space="preserve">. </w:t>
+      </w:r>
+      <w:r>
+        <w:rPr>
+          <w:sz w:val="28"/>
+          <w:szCs w:val="28"/>
+        </w:rPr>
+        <w:t>Результат установки данного движка представлен на рисунке 3.23.</w:t>
+      </w:r>
+    </w:p>
+    <w:p>
+      <w:pPr>
+        <w:spacing w:before="240" w:after="120"/>
+        <w:jc w:val="center"/>
+        <w:rPr>
+          <w:sz w:val="28"/>
+          <w:szCs w:val="28"/>
+        </w:rPr>
+      </w:pPr>
+      <w:r>
+        <w:rPr>
+          <w:sz w:val="28"/>
+          <w:szCs w:val="28"/>
+        </w:rPr>
+        <w:drawing>
+          <wp:inline distT="0" distB="0" distL="0" distR="0" wp14:anchorId="344F00C7" wp14:editId="103FDE8E">
+            <wp:extent cx="6372225" cy="880745"/>
+            <wp:effectExtent l="0" t="0" r="9525" b="0"/>
+            <wp:docPr id="36" name="Рисунок 36"/>
+            <wp:cNvGraphicFramePr>
+              <a:graphicFrameLocks xmlns:a="http://schemas.openxmlformats.org/drawingml/2006/main" noChangeAspect="1"/>
+            </wp:cNvGraphicFramePr>
+            <a:graphic xmlns:a="http://schemas.openxmlformats.org/drawingml/2006/main">
+              <a:graphicData uri="http://schemas.openxmlformats.org/drawingml/2006/picture">
+                <pic:pic xmlns:pic="http://schemas.openxmlformats.org/drawingml/2006/picture">
+                  <pic:nvPicPr>
+                    <pic:cNvPr id="1" name=""/>
+                    <pic:cNvPicPr/>
+                  </pic:nvPicPr>
+                  <pic:blipFill>
+                    <a:blip r:embed="rId43"/>
+                    <a:stretch>
+                      <a:fillRect/>
+                    </a:stretch>
+                  </pic:blipFill>
+                  <pic:spPr>
+                    <a:xfrm>
+                      <a:off x="0" y="0"/>
+                      <a:ext cx="6372225" cy="880745"/>
+                    </a:xfrm>
+                    <a:prstGeom prst="rect">
+                      <a:avLst/>
+                    </a:prstGeom>
+                  </pic:spPr>
+                </pic:pic>
+              </a:graphicData>
+            </a:graphic>
+          </wp:inline>
+        </w:drawing>
+      </w:r>
+    </w:p>
+    <w:p>
+      <w:pPr>
+        <w:jc w:val="center"/>
+        <w:rPr>
+          <w:sz w:val="28"/>
+          <w:szCs w:val="28"/>
+        </w:rPr>
+      </w:pPr>
+      <w:r>
+        <w:rPr>
+          <w:sz w:val="28"/>
+          <w:szCs w:val="28"/>
+        </w:rPr>
+        <w:t xml:space="preserve">Рисунок 3.23 – Результат установки облачного движка </w:t>
+      </w:r>
+      <w:proofErr w:type="spellStart"/>
+      <w:r>
+        <w:rPr>
+          <w:sz w:val="28"/>
+          <w:szCs w:val="28"/>
+          <w:lang w:val="en-US"/>
+        </w:rPr>
+        <w:t>Owncloud</w:t>
+      </w:r>
+      <w:proofErr w:type="spellEnd"/>
+    </w:p>
+    <w:p>
+      <w:pPr>
+        <w:spacing w:before="240"/>
+        <w:ind w:firstLine="708"/>
+        <w:jc w:val="both"/>
+        <w:rPr>
+          <w:sz w:val="28"/>
+          <w:szCs w:val="28"/>
+        </w:rPr>
+      </w:pPr>
+      <w:r>
+        <w:rPr>
+          <w:sz w:val="28"/>
+          <w:szCs w:val="28"/>
+        </w:rPr>
+        <w:t xml:space="preserve">Далее отредактируем конфигурационный файл </w:t>
+      </w:r>
+      <w:r>
+        <w:rPr>
+          <w:sz w:val="28"/>
+          <w:szCs w:val="28"/>
+          <w:lang w:val="en-US"/>
+        </w:rPr>
+        <w:t>cloud</w:t>
+      </w:r>
+      <w:r>
+        <w:rPr>
+          <w:sz w:val="28"/>
+          <w:szCs w:val="28"/>
+        </w:rPr>
+        <w:t>.</w:t>
+      </w:r>
+      <w:proofErr w:type="spellStart"/>
+      <w:r>
+        <w:rPr>
+          <w:sz w:val="28"/>
+          <w:szCs w:val="28"/>
+          <w:lang w:val="en-US"/>
+        </w:rPr>
+        <w:t>filipiuk</w:t>
+      </w:r>
+      <w:proofErr w:type="spellEnd"/>
+      <w:r>
+        <w:rPr>
+          <w:sz w:val="28"/>
+          <w:szCs w:val="28"/>
+        </w:rPr>
+        <w:t>.</w:t>
+      </w:r>
+      <w:r>
+        <w:rPr>
+          <w:sz w:val="28"/>
+          <w:szCs w:val="28"/>
+          <w:lang w:val="en-US"/>
+        </w:rPr>
+        <w:t>by</w:t>
+      </w:r>
+      <w:r>
+        <w:rPr>
+          <w:sz w:val="28"/>
+          <w:szCs w:val="28"/>
+        </w:rPr>
+        <w:t>.</w:t>
+      </w:r>
+      <w:r>
+        <w:rPr>
+          <w:sz w:val="28"/>
+          <w:szCs w:val="28"/>
+          <w:lang w:val="en-US"/>
+        </w:rPr>
+        <w:t>conf</w:t>
+      </w:r>
+      <w:r>
+        <w:rPr>
+          <w:sz w:val="28"/>
+          <w:szCs w:val="28"/>
+        </w:rPr>
+        <w:t xml:space="preserve"> для принятия запросов. Данный конфигурационный файл представлен на рисунке 3.24.</w:t>
+      </w:r>
+    </w:p>
+    <w:p>
+      <w:pPr>
+        <w:spacing w:before="240" w:after="120"/>
+        <w:jc w:val="center"/>
+        <w:rPr>
+          <w:sz w:val="28"/>
+          <w:szCs w:val="28"/>
+        </w:rPr>
+      </w:pPr>
+      <w:r>
+        <w:rPr>
+          <w:sz w:val="28"/>
+          <w:szCs w:val="28"/>
+        </w:rPr>
+        <w:drawing>
+          <wp:inline distT="0" distB="0" distL="0" distR="0" wp14:anchorId="3372C65A" wp14:editId="55303E17">
+            <wp:extent cx="6144482" cy="2876951"/>
+            <wp:effectExtent l="0" t="0" r="8890" b="0"/>
+            <wp:docPr id="37" name="Рисунок 37"/>
+            <wp:cNvGraphicFramePr>
+              <a:graphicFrameLocks xmlns:a="http://schemas.openxmlformats.org/drawingml/2006/main" noChangeAspect="1"/>
+            </wp:cNvGraphicFramePr>
+            <a:graphic xmlns:a="http://schemas.openxmlformats.org/drawingml/2006/main">
+              <a:graphicData uri="http://schemas.openxmlformats.org/drawingml/2006/picture">
+                <pic:pic xmlns:pic="http://schemas.openxmlformats.org/drawingml/2006/picture">
+                  <pic:nvPicPr>
+                    <pic:cNvPr id="1" name=""/>
+                    <pic:cNvPicPr/>
+                  </pic:nvPicPr>
+                  <pic:blipFill>
+                    <a:blip r:embed="rId44"/>
+                    <a:stretch>
+                      <a:fillRect/>
+                    </a:stretch>
+                  </pic:blipFill>
+                  <pic:spPr>
+                    <a:xfrm>
+                      <a:off x="0" y="0"/>
+                      <a:ext cx="6144482" cy="2876951"/>
+                    </a:xfrm>
+                    <a:prstGeom prst="rect">
+                      <a:avLst/>
+                    </a:prstGeom>
+                  </pic:spPr>
+                </pic:pic>
+              </a:graphicData>
+            </a:graphic>
+          </wp:inline>
+        </w:drawing>
+      </w:r>
+    </w:p>
+    <w:p>
+      <w:pPr>
+        <w:jc w:val="center"/>
+        <w:rPr>
+          <w:sz w:val="28"/>
+          <w:szCs w:val="28"/>
+          <w:lang w:val="en-US"/>
+        </w:rPr>
+      </w:pPr>
+      <w:r>
+        <w:rPr>
+          <w:sz w:val="28"/>
+          <w:szCs w:val="28"/>
+        </w:rPr>
+        <w:t xml:space="preserve">Рисунок 3.24 – Конфигурационный файл для </w:t>
+      </w:r>
+      <w:r>
+        <w:rPr>
+          <w:sz w:val="28"/>
+          <w:szCs w:val="28"/>
+          <w:lang w:val="en-US"/>
+        </w:rPr>
+        <w:t>cloud</w:t>
+      </w:r>
+      <w:r>
+        <w:rPr>
+          <w:sz w:val="28"/>
+          <w:szCs w:val="28"/>
+        </w:rPr>
+        <w:t>.</w:t>
+      </w:r>
+      <w:proofErr w:type="spellStart"/>
+      <w:r>
+        <w:rPr>
+          <w:sz w:val="28"/>
+          <w:szCs w:val="28"/>
+          <w:lang w:val="en-US"/>
+        </w:rPr>
+        <w:t>filipiuk</w:t>
+      </w:r>
+      <w:proofErr w:type="spellEnd"/>
+      <w:r>
+        <w:rPr>
+          <w:sz w:val="28"/>
+          <w:szCs w:val="28"/>
+        </w:rPr>
+        <w:t>.</w:t>
+      </w:r>
+      <w:r>
+        <w:rPr>
+          <w:sz w:val="28"/>
+          <w:szCs w:val="28"/>
+          <w:lang w:val="en-US"/>
+        </w:rPr>
+        <w:t>by</w:t>
+      </w:r>
+      <w:r>
+        <w:rPr>
+          <w:sz w:val="28"/>
+          <w:szCs w:val="28"/>
+        </w:rPr>
+        <w:t>.</w:t>
+      </w:r>
+      <w:r>
+        <w:rPr>
+          <w:sz w:val="28"/>
+          <w:szCs w:val="28"/>
+          <w:lang w:val="en-US"/>
+        </w:rPr>
+        <w:t>conf</w:t>
+      </w:r>
+    </w:p>
+    <w:p>
+      <w:pPr>
+        <w:spacing w:before="240"/>
+        <w:ind w:firstLine="708"/>
+        <w:jc w:val="both"/>
+        <w:rPr>
+          <w:sz w:val="28"/>
+          <w:szCs w:val="28"/>
+        </w:rPr>
+      </w:pPr>
+      <w:r>
+        <w:rPr>
+          <w:sz w:val="28"/>
+          <w:szCs w:val="28"/>
+        </w:rPr>
+        <w:t xml:space="preserve">После этого включим нужный хост и перезагрузим службу </w:t>
+      </w:r>
+      <w:proofErr w:type="spellStart"/>
+      <w:r>
+        <w:rPr>
+          <w:sz w:val="28"/>
+          <w:szCs w:val="28"/>
+          <w:lang w:val="en-US"/>
+        </w:rPr>
+        <w:t>apache</w:t>
+      </w:r>
+      <w:proofErr w:type="spellEnd"/>
+      <w:r>
+        <w:rPr>
+          <w:sz w:val="28"/>
+          <w:szCs w:val="28"/>
+        </w:rPr>
+        <w:t xml:space="preserve">2 </w:t>
+      </w:r>
+      <w:r>
+        <w:rPr>
+          <w:sz w:val="28"/>
+          <w:szCs w:val="28"/>
+        </w:rPr>
+        <w:t>для вступления изменений в силу. Результат данной операции представлен на рисунке 3.25.</w:t>
+      </w:r>
+    </w:p>
+    <w:p>
+      <w:pPr>
+        <w:jc w:val="center"/>
+        <w:rPr>
+          <w:sz w:val="28"/>
+          <w:szCs w:val="28"/>
+        </w:rPr>
+      </w:pPr>
+      <w:r>
+        <w:rPr>
+          <w:sz w:val="28"/>
+          <w:szCs w:val="28"/>
+        </w:rPr>
+        <w:lastRenderedPageBreak/>
+        <w:drawing>
+          <wp:inline distT="0" distB="0" distL="0" distR="0" wp14:anchorId="129943C7" wp14:editId="1CC9F353">
+            <wp:extent cx="5382376" cy="1476581"/>
+            <wp:effectExtent l="0" t="0" r="8890" b="9525"/>
+            <wp:docPr id="38" name="Рисунок 38"/>
+            <wp:cNvGraphicFramePr>
+              <a:graphicFrameLocks xmlns:a="http://schemas.openxmlformats.org/drawingml/2006/main" noChangeAspect="1"/>
+            </wp:cNvGraphicFramePr>
+            <a:graphic xmlns:a="http://schemas.openxmlformats.org/drawingml/2006/main">
+              <a:graphicData uri="http://schemas.openxmlformats.org/drawingml/2006/picture">
+                <pic:pic xmlns:pic="http://schemas.openxmlformats.org/drawingml/2006/picture">
+                  <pic:nvPicPr>
+                    <pic:cNvPr id="1" name=""/>
+                    <pic:cNvPicPr/>
+                  </pic:nvPicPr>
+                  <pic:blipFill>
+                    <a:blip r:embed="rId45"/>
+                    <a:stretch>
+                      <a:fillRect/>
+                    </a:stretch>
+                  </pic:blipFill>
+                  <pic:spPr>
+                    <a:xfrm>
+                      <a:off x="0" y="0"/>
+                      <a:ext cx="5382376" cy="1476581"/>
+                    </a:xfrm>
+                    <a:prstGeom prst="rect">
+                      <a:avLst/>
+                    </a:prstGeom>
+                  </pic:spPr>
+                </pic:pic>
+              </a:graphicData>
+            </a:graphic>
+          </wp:inline>
+        </w:drawing>
+      </w:r>
+    </w:p>
+    <w:p>
+      <w:pPr>
+        <w:jc w:val="center"/>
+        <w:rPr>
+          <w:sz w:val="28"/>
+          <w:szCs w:val="28"/>
+        </w:rPr>
+      </w:pPr>
+      <w:r>
+        <w:rPr>
+          <w:sz w:val="28"/>
+          <w:szCs w:val="28"/>
+        </w:rPr>
+        <w:t>Рисунок 3.25 – Результат применения изменений конфигурации</w:t>
       </w:r>
     </w:p>
     <w:p>

</xml_diff>

<commit_message>
ISAS: lab2 report modified
</commit_message>
<xml_diff>
--- a/ISAS/Reports/Report_2.docx
+++ b/ISAS/Reports/Report_2.docx
@@ -10,17 +10,6 @@
           <w:szCs w:val="28"/>
         </w:rPr>
       </w:pPr>
-      <w:proofErr w:type="spellStart"/>
-      <w:r>
-        <w:rPr>
-          <w:color w:val="000000"/>
-          <w:sz w:val="28"/>
-          <w:szCs w:val="28"/>
-          <w:lang w:val="en-US"/>
-        </w:rPr>
-        <w:t>cle</w:t>
-      </w:r>
-      <w:proofErr w:type="spellEnd"/>
       <w:r>
         <w:rPr>
           <w:color w:val="000000"/>
@@ -6555,6 +6544,7 @@
       </w:pPr>
       <w:r>
         <w:rPr>
+          <w:noProof/>
           <w:sz w:val="28"/>
           <w:szCs w:val="28"/>
         </w:rPr>
@@ -6720,6 +6710,7 @@
       </w:pPr>
       <w:r>
         <w:rPr>
+          <w:noProof/>
           <w:sz w:val="28"/>
           <w:szCs w:val="28"/>
         </w:rPr>
@@ -7040,6 +7031,7 @@
       </w:pPr>
       <w:r>
         <w:rPr>
+          <w:noProof/>
           <w:sz w:val="28"/>
           <w:szCs w:val="28"/>
         </w:rPr>
@@ -7086,7 +7078,6 @@
         <w:rPr>
           <w:sz w:val="28"/>
           <w:szCs w:val="28"/>
-          <w:lang w:val="en-US"/>
         </w:rPr>
       </w:pPr>
       <w:r>
@@ -7262,6 +7253,7 @@
       </w:pPr>
       <w:r>
         <w:rPr>
+          <w:noProof/>
           <w:sz w:val="28"/>
           <w:szCs w:val="28"/>
         </w:rPr>
@@ -7391,6 +7383,7 @@
       </w:pPr>
       <w:r>
         <w:rPr>
+          <w:noProof/>
           <w:sz w:val="28"/>
           <w:szCs w:val="28"/>
         </w:rPr>
@@ -7502,6 +7495,7 @@
       </w:pPr>
       <w:r>
         <w:rPr>
+          <w:noProof/>
           <w:sz w:val="28"/>
           <w:szCs w:val="28"/>
         </w:rPr>
@@ -7548,7 +7542,6 @@
         <w:rPr>
           <w:sz w:val="28"/>
           <w:szCs w:val="28"/>
-          <w:lang w:val="en-US"/>
         </w:rPr>
       </w:pPr>
       <w:r>
@@ -7615,6 +7608,7 @@
       </w:pPr>
       <w:r>
         <w:rPr>
+          <w:noProof/>
           <w:sz w:val="28"/>
           <w:szCs w:val="28"/>
         </w:rPr>
@@ -7752,6 +7746,7 @@
       </w:pPr>
       <w:r>
         <w:rPr>
+          <w:noProof/>
           <w:sz w:val="28"/>
           <w:szCs w:val="28"/>
         </w:rPr>
@@ -7862,6 +7857,7 @@
       </w:pPr>
       <w:r>
         <w:rPr>
+          <w:noProof/>
           <w:sz w:val="28"/>
           <w:szCs w:val="28"/>
         </w:rPr>

</xml_diff>